<commit_message>
Knowledge - 3-Work knowledge - fix location - part 17 - 11/8/2025
</commit_message>
<xml_diff>
--- a/Knowledge/3-Work knowledge/1-Software Engineering/1-Testing/5-My Source/1-ISTQB Foundation Level/1-Testing terms/1-Evaluating quality and Quality Status.docx
+++ b/Knowledge/3-Work knowledge/1-Software Engineering/1-Testing/5-My Source/1-ISTQB Foundation Level/1-Testing terms/1-Evaluating quality and Quality Status.docx
@@ -51,7 +51,26 @@
           <w:szCs w:val="14"/>
           <w:shd w:val="clear" w:color="auto" w:fill="B7B7B7"/>
         </w:rPr>
-        <w:t>(GPT-5-Standard) at [8/12/2025]</w:t>
+        <w:t>(GPT</w:t>
+      </w:r>
+      <w:r>
+        <w:rPr>
+          <w:rFonts w:ascii="Cambria Math" w:hAnsi="Cambria Math" w:cs="Cambria Math"/>
+          <w:b/>
+          <w:sz w:val="14"/>
+          <w:szCs w:val="14"/>
+          <w:shd w:val="clear" w:color="auto" w:fill="B7B7B7"/>
+        </w:rPr>
+        <w:t>‑</w:t>
+      </w:r>
+      <w:r>
+        <w:rPr>
+          <w:b/>
+          <w:sz w:val="14"/>
+          <w:szCs w:val="14"/>
+          <w:shd w:val="clear" w:color="auto" w:fill="B7B7B7"/>
+        </w:rPr>
+        <w:t>5 Mini) at [8/12/2025]</w:t>
       </w:r>
     </w:p>
     <w:p>
@@ -222,7 +241,7 @@
     </w:p>
     <w:p>
       <w:r>
-        <w:pict w14:anchorId="77D3B9C7">
+        <w:pict w14:anchorId="5BD5F131">
           <v:rect id="_x0000_i1025" style="width:0;height:1.5pt" o:hralign="center" o:hrstd="t" o:hr="t" fillcolor="#a0a0a0" stroked="f"/>
         </w:pict>
       </w:r>
@@ -268,7 +287,26 @@
           <w:szCs w:val="14"/>
           <w:shd w:val="clear" w:color="auto" w:fill="B7B7B7"/>
         </w:rPr>
-        <w:t>(GPT-5-Standard) at [8/12/2025]</w:t>
+        <w:t>(GPT</w:t>
+      </w:r>
+      <w:r>
+        <w:rPr>
+          <w:rFonts w:ascii="Cambria Math" w:hAnsi="Cambria Math" w:cs="Cambria Math"/>
+          <w:b/>
+          <w:sz w:val="14"/>
+          <w:szCs w:val="14"/>
+          <w:shd w:val="clear" w:color="auto" w:fill="B7B7B7"/>
+        </w:rPr>
+        <w:t>‑</w:t>
+      </w:r>
+      <w:r>
+        <w:rPr>
+          <w:b/>
+          <w:sz w:val="14"/>
+          <w:szCs w:val="14"/>
+          <w:shd w:val="clear" w:color="auto" w:fill="B7B7B7"/>
+        </w:rPr>
+        <w:t>5 Mini) at [8/12/2025]</w:t>
       </w:r>
     </w:p>
     <w:p>
@@ -467,7 +505,7 @@
     </w:p>
     <w:p>
       <w:r>
-        <w:pict w14:anchorId="1D7295E1">
+        <w:pict w14:anchorId="3992BC18">
           <v:rect id="_x0000_i1026" style="width:0;height:1.5pt" o:hralign="center" o:hrstd="t" o:hr="t" fillcolor="#a0a0a0" stroked="f"/>
         </w:pict>
       </w:r>
@@ -513,7 +551,26 @@
           <w:szCs w:val="14"/>
           <w:shd w:val="clear" w:color="auto" w:fill="B7B7B7"/>
         </w:rPr>
-        <w:t>(GPT-5-Standard) at [8/12/2025]</w:t>
+        <w:t>(GPT</w:t>
+      </w:r>
+      <w:r>
+        <w:rPr>
+          <w:rFonts w:ascii="Cambria Math" w:hAnsi="Cambria Math" w:cs="Cambria Math"/>
+          <w:b/>
+          <w:sz w:val="14"/>
+          <w:szCs w:val="14"/>
+          <w:shd w:val="clear" w:color="auto" w:fill="B7B7B7"/>
+        </w:rPr>
+        <w:t>‑</w:t>
+      </w:r>
+      <w:r>
+        <w:rPr>
+          <w:b/>
+          <w:sz w:val="14"/>
+          <w:szCs w:val="14"/>
+          <w:shd w:val="clear" w:color="auto" w:fill="B7B7B7"/>
+        </w:rPr>
+        <w:t>5 Mini) at [8/12/2025]</w:t>
       </w:r>
     </w:p>
     <w:p>
@@ -656,16 +713,17 @@
           <w:szCs w:val="14"/>
           <w:shd w:val="clear" w:color="auto" w:fill="B7B7B7"/>
         </w:rPr>
-        <w:t>(GPT-5-Standard) at [</w:t>
-      </w:r>
-      <w:r>
-        <w:rPr>
+        <w:t>(GPT</w:t>
+      </w:r>
+      <w:r>
+        <w:rPr>
+          <w:rFonts w:ascii="Cambria Math" w:hAnsi="Cambria Math" w:cs="Cambria Math"/>
           <w:b/>
           <w:sz w:val="14"/>
           <w:szCs w:val="14"/>
           <w:shd w:val="clear" w:color="auto" w:fill="B7B7B7"/>
         </w:rPr>
-        <w:t>9</w:t>
+        <w:t>‑</w:t>
       </w:r>
       <w:r>
         <w:rPr>
@@ -674,7 +732,170 @@
           <w:szCs w:val="14"/>
           <w:shd w:val="clear" w:color="auto" w:fill="B7B7B7"/>
         </w:rPr>
-        <w:t>/</w:t>
+        <w:t>5 Mini) at [9/4/2025]</w:t>
+      </w:r>
+    </w:p>
+    <w:p>
+      <w:pPr>
+        <w:rPr>
+          <w:rFonts w:ascii="Roboto Mono" w:hAnsi="Roboto Mono"/>
+          <w:lang w:val="en-US"/>
+        </w:rPr>
+      </w:pPr>
+      <w:r>
+        <w:rPr>
+          <w:rFonts w:ascii="Roboto Mono" w:hAnsi="Roboto Mono"/>
+          <w:b/>
+          <w:bCs/>
+          <w:lang w:val="en-US"/>
+        </w:rPr>
+        <w:t>Quality Status</w:t>
+      </w:r>
+      <w:r>
+        <w:rPr>
+          <w:rFonts w:ascii="Roboto Mono" w:hAnsi="Roboto Mono"/>
+          <w:lang w:val="en-US"/>
+        </w:rPr>
+        <w:t xml:space="preserve"> is a </w:t>
+      </w:r>
+      <w:r>
+        <w:rPr>
+          <w:rFonts w:ascii="Roboto Mono" w:hAnsi="Roboto Mono"/>
+          <w:b/>
+          <w:bCs/>
+          <w:lang w:val="en-US"/>
+        </w:rPr>
+        <w:t>measure or indication of the current quality of a software product</w:t>
+      </w:r>
+      <w:r>
+        <w:rPr>
+          <w:rFonts w:ascii="Roboto Mono" w:hAnsi="Roboto Mono"/>
+          <w:lang w:val="en-US"/>
+        </w:rPr>
+        <w:t xml:space="preserve"> at a given point in time.</w:t>
+      </w:r>
+    </w:p>
+    <w:p>
+      <w:pPr>
+        <w:rPr>
+          <w:rFonts w:ascii="Roboto Mono" w:hAnsi="Roboto Mono"/>
+          <w:lang w:val="en-US"/>
+        </w:rPr>
+      </w:pPr>
+      <w:r>
+        <w:rPr>
+          <w:rFonts w:ascii="Roboto Mono" w:hAnsi="Roboto Mono"/>
+          <w:lang w:val="en-US"/>
+        </w:rPr>
+        <w:t xml:space="preserve">In simple terms: it tells </w:t>
+      </w:r>
+      <w:r>
+        <w:rPr>
+          <w:rFonts w:ascii="Roboto Mono" w:hAnsi="Roboto Mono"/>
+          <w:b/>
+          <w:bCs/>
+          <w:lang w:val="en-US"/>
+        </w:rPr>
+        <w:t>how good or reliable the software is right now</w:t>
+      </w:r>
+      <w:r>
+        <w:rPr>
+          <w:rFonts w:ascii="Roboto Mono" w:hAnsi="Roboto Mono"/>
+          <w:lang w:val="en-US"/>
+        </w:rPr>
+        <w:t>, based on testing results, defects found, and coverage achieved.</w:t>
+      </w:r>
+    </w:p>
+    <w:p>
+      <w:pPr>
+        <w:rPr>
+          <w:rFonts w:ascii="Roboto Mono" w:hAnsi="Roboto Mono"/>
+          <w:lang w:val="en-US"/>
+        </w:rPr>
+      </w:pPr>
+      <w:r>
+        <w:rPr>
+          <w:rFonts w:ascii="Roboto Mono" w:hAnsi="Roboto Mono"/>
+          <w:lang w:val="en-US"/>
+        </w:rPr>
+        <w:t xml:space="preserve">It is often reported in </w:t>
+      </w:r>
+      <w:r>
+        <w:rPr>
+          <w:rFonts w:ascii="Roboto Mono" w:hAnsi="Roboto Mono"/>
+          <w:b/>
+          <w:bCs/>
+          <w:lang w:val="en-US"/>
+        </w:rPr>
+        <w:t>test reports</w:t>
+      </w:r>
+      <w:r>
+        <w:rPr>
+          <w:rFonts w:ascii="Roboto Mono" w:hAnsi="Roboto Mono"/>
+          <w:lang w:val="en-US"/>
+        </w:rPr>
+        <w:t xml:space="preserve"> to help stakeholders decide whether the product is ready for release, needs more testing, or requires fixes.</w:t>
+      </w:r>
+    </w:p>
+    <w:p>
+      <w:pPr>
+        <w:rPr>
+          <w:lang w:val="en-US"/>
+        </w:rPr>
+      </w:pPr>
+      <w:r>
+        <w:rPr>
+          <w:lang w:val="en-US"/>
+        </w:rPr>
+        <w:pict w14:anchorId="4D46AFA6">
+          <v:rect id="_x0000_i1027" style="width:0;height:1.5pt" o:hralign="center" o:hrstd="t" o:hr="t" fillcolor="#a0a0a0" stroked="f"/>
+        </w:pict>
+      </w:r>
+    </w:p>
+    <w:p>
+      <w:pPr>
+        <w:pStyle w:val="Heading3"/>
+        <w:rPr>
+          <w:lang w:val="en-US"/>
+        </w:rPr>
+      </w:pPr>
+      <w:r>
+        <w:rPr>
+          <w:rFonts w:ascii="Segoe UI Emoji" w:hAnsi="Segoe UI Emoji" w:cs="Segoe UI Emoji"/>
+          <w:lang w:val="en-US"/>
+        </w:rPr>
+        <w:t>🔹</w:t>
+      </w:r>
+      <w:r>
+        <w:rPr>
+          <w:lang w:val="en-US"/>
+        </w:rPr>
+        <w:t xml:space="preserve"> What Determines Quality Status</w:t>
+      </w:r>
+    </w:p>
+    <w:p>
+      <w:pPr>
+        <w:spacing w:before="240" w:after="240"/>
+      </w:pPr>
+      <w:r>
+        <w:rPr>
+          <w:b/>
+          <w:shd w:val="clear" w:color="auto" w:fill="B7B7B7"/>
+        </w:rPr>
+        <w:t># Source</w:t>
+      </w:r>
+      <w:r>
+        <w:rPr>
+          <w:shd w:val="clear" w:color="auto" w:fill="B7B7B7"/>
+        </w:rPr>
+        <w:t xml:space="preserve">: </w:t>
+      </w:r>
+      <w:r>
+        <w:rPr>
+          <w:b/>
+          <w:shd w:val="clear" w:color="auto" w:fill="B7B7B7"/>
+        </w:rPr>
+        <w:t xml:space="preserve">Chatgpt </w:t>
       </w:r>
       <w:r>
         <w:rPr>
@@ -683,179 +904,17 @@
           <w:szCs w:val="14"/>
           <w:shd w:val="clear" w:color="auto" w:fill="B7B7B7"/>
         </w:rPr>
-        <w:t>4</w:t>
-      </w:r>
-      <w:r>
-        <w:rPr>
+        <w:t>(GPT</w:t>
+      </w:r>
+      <w:r>
+        <w:rPr>
+          <w:rFonts w:ascii="Cambria Math" w:hAnsi="Cambria Math" w:cs="Cambria Math"/>
           <w:b/>
           <w:sz w:val="14"/>
           <w:szCs w:val="14"/>
           <w:shd w:val="clear" w:color="auto" w:fill="B7B7B7"/>
         </w:rPr>
-        <w:t>/2025]</w:t>
-      </w:r>
-    </w:p>
-    <w:p>
-      <w:pPr>
-        <w:rPr>
-          <w:rFonts w:ascii="Roboto Mono" w:hAnsi="Roboto Mono"/>
-          <w:lang w:val="en-US"/>
-        </w:rPr>
-      </w:pPr>
-      <w:r>
-        <w:rPr>
-          <w:rFonts w:ascii="Roboto Mono" w:hAnsi="Roboto Mono"/>
-          <w:b/>
-          <w:bCs/>
-          <w:lang w:val="en-US"/>
-        </w:rPr>
-        <w:t>Quality Status</w:t>
-      </w:r>
-      <w:r>
-        <w:rPr>
-          <w:rFonts w:ascii="Roboto Mono" w:hAnsi="Roboto Mono"/>
-          <w:lang w:val="en-US"/>
-        </w:rPr>
-        <w:t xml:space="preserve"> is a </w:t>
-      </w:r>
-      <w:r>
-        <w:rPr>
-          <w:rFonts w:ascii="Roboto Mono" w:hAnsi="Roboto Mono"/>
-          <w:b/>
-          <w:bCs/>
-          <w:lang w:val="en-US"/>
-        </w:rPr>
-        <w:t>measure or indication of the current quality of a software product</w:t>
-      </w:r>
-      <w:r>
-        <w:rPr>
-          <w:rFonts w:ascii="Roboto Mono" w:hAnsi="Roboto Mono"/>
-          <w:lang w:val="en-US"/>
-        </w:rPr>
-        <w:t xml:space="preserve"> at a given point in time.</w:t>
-      </w:r>
-    </w:p>
-    <w:p>
-      <w:pPr>
-        <w:rPr>
-          <w:rFonts w:ascii="Roboto Mono" w:hAnsi="Roboto Mono"/>
-          <w:lang w:val="en-US"/>
-        </w:rPr>
-      </w:pPr>
-      <w:r>
-        <w:rPr>
-          <w:rFonts w:ascii="Roboto Mono" w:hAnsi="Roboto Mono"/>
-          <w:lang w:val="en-US"/>
-        </w:rPr>
-        <w:t xml:space="preserve">In simple terms: it tells </w:t>
-      </w:r>
-      <w:r>
-        <w:rPr>
-          <w:rFonts w:ascii="Roboto Mono" w:hAnsi="Roboto Mono"/>
-          <w:b/>
-          <w:bCs/>
-          <w:lang w:val="en-US"/>
-        </w:rPr>
-        <w:t>how good or reliable the software is right now</w:t>
-      </w:r>
-      <w:r>
-        <w:rPr>
-          <w:rFonts w:ascii="Roboto Mono" w:hAnsi="Roboto Mono"/>
-          <w:lang w:val="en-US"/>
-        </w:rPr>
-        <w:t>, based on testing results, defects found, and coverage achieved.</w:t>
-      </w:r>
-    </w:p>
-    <w:p>
-      <w:pPr>
-        <w:rPr>
-          <w:rFonts w:ascii="Roboto Mono" w:hAnsi="Roboto Mono"/>
-          <w:lang w:val="en-US"/>
-        </w:rPr>
-      </w:pPr>
-      <w:r>
-        <w:rPr>
-          <w:rFonts w:ascii="Roboto Mono" w:hAnsi="Roboto Mono"/>
-          <w:lang w:val="en-US"/>
-        </w:rPr>
-        <w:t xml:space="preserve">It is often reported in </w:t>
-      </w:r>
-      <w:r>
-        <w:rPr>
-          <w:rFonts w:ascii="Roboto Mono" w:hAnsi="Roboto Mono"/>
-          <w:b/>
-          <w:bCs/>
-          <w:lang w:val="en-US"/>
-        </w:rPr>
-        <w:t>test reports</w:t>
-      </w:r>
-      <w:r>
-        <w:rPr>
-          <w:rFonts w:ascii="Roboto Mono" w:hAnsi="Roboto Mono"/>
-          <w:lang w:val="en-US"/>
-        </w:rPr>
-        <w:t xml:space="preserve"> to help stakeholders decide whether the product is ready for release, needs more testing, or requires fixes.</w:t>
-      </w:r>
-    </w:p>
-    <w:p>
-      <w:pPr>
-        <w:rPr>
-          <w:lang w:val="en-US"/>
-        </w:rPr>
-      </w:pPr>
-      <w:r>
-        <w:rPr>
-          <w:lang w:val="en-US"/>
-        </w:rPr>
-        <w:pict w14:anchorId="3CE22F2A">
-          <v:rect id="_x0000_i1062" style="width:0;height:1.5pt" o:hralign="center" o:hrstd="t" o:hr="t" fillcolor="#a0a0a0" stroked="f"/>
-        </w:pict>
-      </w:r>
-    </w:p>
-    <w:p>
-      <w:pPr>
-        <w:pStyle w:val="Heading3"/>
-        <w:rPr>
-          <w:lang w:val="en-US"/>
-        </w:rPr>
-      </w:pPr>
-      <w:r>
-        <w:rPr>
-          <w:rFonts w:ascii="Segoe UI Emoji" w:hAnsi="Segoe UI Emoji" w:cs="Segoe UI Emoji"/>
-          <w:lang w:val="en-US"/>
-        </w:rPr>
-        <w:t>🔹</w:t>
-      </w:r>
-      <w:r>
-        <w:rPr>
-          <w:lang w:val="en-US"/>
-        </w:rPr>
-        <w:t xml:space="preserve"> What Determines Quality Status</w:t>
-      </w:r>
-    </w:p>
-    <w:p>
-      <w:pPr>
-        <w:spacing w:before="240" w:after="240"/>
-      </w:pPr>
-      <w:r>
-        <w:rPr>
-          <w:b/>
-          <w:shd w:val="clear" w:color="auto" w:fill="B7B7B7"/>
-        </w:rPr>
-        <w:t># Source</w:t>
-      </w:r>
-      <w:r>
-        <w:rPr>
-          <w:shd w:val="clear" w:color="auto" w:fill="B7B7B7"/>
-        </w:rPr>
-        <w:t xml:space="preserve">: </w:t>
-      </w:r>
-      <w:r>
-        <w:rPr>
-          <w:b/>
-          <w:shd w:val="clear" w:color="auto" w:fill="B7B7B7"/>
-        </w:rPr>
-        <w:t xml:space="preserve">Chatgpt </w:t>
+        <w:t>‑</w:t>
       </w:r>
       <w:r>
         <w:rPr>
@@ -864,7 +923,359 @@
           <w:szCs w:val="14"/>
           <w:shd w:val="clear" w:color="auto" w:fill="B7B7B7"/>
         </w:rPr>
-        <w:t>(GPT-5-Standard) at [9/4/2025]</w:t>
+        <w:t>5 Mini) at [9/4/2025]</w:t>
+      </w:r>
+    </w:p>
+    <w:p>
+      <w:pPr>
+        <w:numPr>
+          <w:ilvl w:val="0"/>
+          <w:numId w:val="4"/>
+        </w:numPr>
+        <w:rPr>
+          <w:rFonts w:ascii="Roboto Mono" w:hAnsi="Roboto Mono"/>
+          <w:lang w:val="en-US"/>
+        </w:rPr>
+      </w:pPr>
+      <w:r>
+        <w:rPr>
+          <w:rFonts w:ascii="Roboto Mono" w:hAnsi="Roboto Mono"/>
+          <w:b/>
+          <w:bCs/>
+          <w:lang w:val="en-US"/>
+        </w:rPr>
+        <w:t>Test Execution Results</w:t>
+      </w:r>
+    </w:p>
+    <w:p>
+      <w:pPr>
+        <w:numPr>
+          <w:ilvl w:val="1"/>
+          <w:numId w:val="4"/>
+        </w:numPr>
+        <w:rPr>
+          <w:rFonts w:ascii="Roboto Mono" w:hAnsi="Roboto Mono"/>
+          <w:lang w:val="en-US"/>
+        </w:rPr>
+      </w:pPr>
+      <w:r>
+        <w:rPr>
+          <w:rFonts w:ascii="Roboto Mono" w:hAnsi="Roboto Mono"/>
+          <w:lang w:val="en-US"/>
+        </w:rPr>
+        <w:lastRenderedPageBreak/>
+        <w:t>Number of test cases passed, failed, or blocked.</w:t>
+      </w:r>
+    </w:p>
+    <w:p>
+      <w:pPr>
+        <w:numPr>
+          <w:ilvl w:val="0"/>
+          <w:numId w:val="4"/>
+        </w:numPr>
+        <w:rPr>
+          <w:rFonts w:ascii="Roboto Mono" w:hAnsi="Roboto Mono"/>
+          <w:lang w:val="en-US"/>
+        </w:rPr>
+      </w:pPr>
+      <w:r>
+        <w:rPr>
+          <w:rFonts w:ascii="Roboto Mono" w:hAnsi="Roboto Mono"/>
+          <w:b/>
+          <w:bCs/>
+          <w:lang w:val="en-US"/>
+        </w:rPr>
+        <w:t>Defects Found</w:t>
+      </w:r>
+    </w:p>
+    <w:p>
+      <w:pPr>
+        <w:numPr>
+          <w:ilvl w:val="1"/>
+          <w:numId w:val="4"/>
+        </w:numPr>
+        <w:rPr>
+          <w:rFonts w:ascii="Roboto Mono" w:hAnsi="Roboto Mono"/>
+          <w:lang w:val="en-US"/>
+        </w:rPr>
+      </w:pPr>
+      <w:r>
+        <w:rPr>
+          <w:rFonts w:ascii="Roboto Mono" w:hAnsi="Roboto Mono"/>
+          <w:lang w:val="en-US"/>
+        </w:rPr>
+        <w:t>Number of critical, major, and minor defects.</w:t>
+      </w:r>
+    </w:p>
+    <w:p>
+      <w:pPr>
+        <w:numPr>
+          <w:ilvl w:val="1"/>
+          <w:numId w:val="4"/>
+        </w:numPr>
+        <w:rPr>
+          <w:rFonts w:ascii="Roboto Mono" w:hAnsi="Roboto Mono"/>
+          <w:lang w:val="en-US"/>
+        </w:rPr>
+      </w:pPr>
+      <w:r>
+        <w:rPr>
+          <w:rFonts w:ascii="Roboto Mono" w:hAnsi="Roboto Mono"/>
+          <w:lang w:val="en-US"/>
+        </w:rPr>
+        <w:t>Severity and impact of defects on the system.</w:t>
+      </w:r>
+    </w:p>
+    <w:p>
+      <w:pPr>
+        <w:numPr>
+          <w:ilvl w:val="0"/>
+          <w:numId w:val="4"/>
+        </w:numPr>
+        <w:rPr>
+          <w:rFonts w:ascii="Roboto Mono" w:hAnsi="Roboto Mono"/>
+          <w:lang w:val="en-US"/>
+        </w:rPr>
+      </w:pPr>
+      <w:r>
+        <w:rPr>
+          <w:rFonts w:ascii="Roboto Mono" w:hAnsi="Roboto Mono"/>
+          <w:b/>
+          <w:bCs/>
+          <w:lang w:val="en-US"/>
+        </w:rPr>
+        <w:t>Coverage Metrics</w:t>
+      </w:r>
+    </w:p>
+    <w:p>
+      <w:pPr>
+        <w:numPr>
+          <w:ilvl w:val="1"/>
+          <w:numId w:val="4"/>
+        </w:numPr>
+        <w:rPr>
+          <w:rFonts w:ascii="Roboto Mono" w:hAnsi="Roboto Mono"/>
+          <w:lang w:val="en-US"/>
+        </w:rPr>
+      </w:pPr>
+      <w:r>
+        <w:rPr>
+          <w:rFonts w:ascii="Roboto Mono" w:hAnsi="Roboto Mono"/>
+          <w:lang w:val="en-US"/>
+        </w:rPr>
+        <w:t>Percentage of requirements, code, or features tested.</w:t>
+      </w:r>
+    </w:p>
+    <w:p>
+      <w:pPr>
+        <w:numPr>
+          <w:ilvl w:val="1"/>
+          <w:numId w:val="4"/>
+        </w:numPr>
+        <w:rPr>
+          <w:rFonts w:ascii="Roboto Mono" w:hAnsi="Roboto Mono"/>
+          <w:lang w:val="en-US"/>
+        </w:rPr>
+      </w:pPr>
+      <w:r>
+        <w:rPr>
+          <w:rFonts w:ascii="Roboto Mono" w:hAnsi="Roboto Mono"/>
+          <w:lang w:val="en-US"/>
+        </w:rPr>
+        <w:t>How much of the high-risk functionality has been covered.</w:t>
+      </w:r>
+    </w:p>
+    <w:p>
+      <w:pPr>
+        <w:numPr>
+          <w:ilvl w:val="0"/>
+          <w:numId w:val="4"/>
+        </w:numPr>
+        <w:rPr>
+          <w:rFonts w:ascii="Roboto Mono" w:hAnsi="Roboto Mono"/>
+          <w:lang w:val="en-US"/>
+        </w:rPr>
+      </w:pPr>
+      <w:r>
+        <w:rPr>
+          <w:rFonts w:ascii="Roboto Mono" w:hAnsi="Roboto Mono"/>
+          <w:b/>
+          <w:bCs/>
+          <w:lang w:val="en-US"/>
+        </w:rPr>
+        <w:t>Risk Assessment</w:t>
+      </w:r>
+    </w:p>
+    <w:p>
+      <w:pPr>
+        <w:numPr>
+          <w:ilvl w:val="1"/>
+          <w:numId w:val="4"/>
+        </w:numPr>
+        <w:rPr>
+          <w:rFonts w:ascii="Roboto Mono" w:hAnsi="Roboto Mono"/>
+          <w:lang w:val="en-US"/>
+        </w:rPr>
+      </w:pPr>
+      <w:r>
+        <w:rPr>
+          <w:rFonts w:ascii="Roboto Mono" w:hAnsi="Roboto Mono"/>
+          <w:lang w:val="en-US"/>
+        </w:rPr>
+        <w:t>Are there unresolved risks that may affect the product?</w:t>
+      </w:r>
+    </w:p>
+    <w:p>
+      <w:pPr>
+        <w:numPr>
+          <w:ilvl w:val="0"/>
+          <w:numId w:val="4"/>
+        </w:numPr>
+        <w:rPr>
+          <w:rFonts w:ascii="Roboto Mono" w:hAnsi="Roboto Mono"/>
+          <w:lang w:val="en-US"/>
+        </w:rPr>
+      </w:pPr>
+      <w:r>
+        <w:rPr>
+          <w:rFonts w:ascii="Roboto Mono" w:hAnsi="Roboto Mono"/>
+          <w:b/>
+          <w:bCs/>
+          <w:lang w:val="en-US"/>
+        </w:rPr>
+        <w:t>Compliance with Standards</w:t>
+      </w:r>
+    </w:p>
+    <w:p>
+      <w:pPr>
+        <w:numPr>
+          <w:ilvl w:val="1"/>
+          <w:numId w:val="4"/>
+        </w:numPr>
+        <w:rPr>
+          <w:rFonts w:ascii="Roboto Mono" w:hAnsi="Roboto Mono"/>
+          <w:lang w:val="en-US"/>
+        </w:rPr>
+      </w:pPr>
+      <w:r>
+        <w:rPr>
+          <w:rFonts w:ascii="Roboto Mono" w:hAnsi="Roboto Mono"/>
+          <w:lang w:val="en-US"/>
+        </w:rPr>
+        <w:t>Does the product meet functional, security, performance, and regulatory requirements?</w:t>
+      </w:r>
+    </w:p>
+    <w:p>
+      <w:pPr>
+        <w:rPr>
+          <w:lang w:val="en-US"/>
+        </w:rPr>
+      </w:pPr>
+      <w:r>
+        <w:rPr>
+          <w:lang w:val="en-US"/>
+        </w:rPr>
+        <w:pict w14:anchorId="2BCD3F5C">
+          <v:rect id="_x0000_i1028" style="width:0;height:1.5pt" o:hralign="center" o:hrstd="t" o:hr="t" fillcolor="#a0a0a0" stroked="f"/>
+        </w:pict>
+      </w:r>
+    </w:p>
+    <w:p>
+      <w:pPr>
+        <w:pStyle w:val="Heading3"/>
+        <w:rPr>
+          <w:lang w:val="en-US"/>
+        </w:rPr>
+      </w:pPr>
+      <w:r>
+        <w:rPr>
+          <w:rFonts w:ascii="Segoe UI Emoji" w:hAnsi="Segoe UI Emoji" w:cs="Segoe UI Emoji"/>
+          <w:lang w:val="en-US"/>
+        </w:rPr>
+        <w:t>🔹</w:t>
+      </w:r>
+      <w:r>
+        <w:rPr>
+          <w:lang w:val="en-US"/>
+        </w:rPr>
+        <w:t xml:space="preserve"> Example of Quality Status</w:t>
+      </w:r>
+    </w:p>
+    <w:p>
+      <w:pPr>
+        <w:spacing w:before="240" w:after="240"/>
+      </w:pPr>
+      <w:r>
+        <w:rPr>
+          <w:b/>
+          <w:shd w:val="clear" w:color="auto" w:fill="B7B7B7"/>
+        </w:rPr>
+        <w:t># Source</w:t>
+      </w:r>
+      <w:r>
+        <w:rPr>
+          <w:shd w:val="clear" w:color="auto" w:fill="B7B7B7"/>
+        </w:rPr>
+        <w:t xml:space="preserve">: </w:t>
+      </w:r>
+      <w:r>
+        <w:rPr>
+          <w:b/>
+          <w:shd w:val="clear" w:color="auto" w:fill="B7B7B7"/>
+        </w:rPr>
+        <w:t xml:space="preserve">Chatgpt </w:t>
+      </w:r>
+      <w:r>
+        <w:rPr>
+          <w:b/>
+          <w:sz w:val="14"/>
+          <w:szCs w:val="14"/>
+          <w:shd w:val="clear" w:color="auto" w:fill="B7B7B7"/>
+        </w:rPr>
+        <w:t>(GPT</w:t>
+      </w:r>
+      <w:r>
+        <w:rPr>
+          <w:rFonts w:ascii="Cambria Math" w:hAnsi="Cambria Math" w:cs="Cambria Math"/>
+          <w:b/>
+          <w:sz w:val="14"/>
+          <w:szCs w:val="14"/>
+          <w:shd w:val="clear" w:color="auto" w:fill="B7B7B7"/>
+        </w:rPr>
+        <w:t>‑</w:t>
+      </w:r>
+      <w:r>
+        <w:rPr>
+          <w:b/>
+          <w:sz w:val="14"/>
+          <w:szCs w:val="14"/>
+          <w:shd w:val="clear" w:color="auto" w:fill="B7B7B7"/>
+        </w:rPr>
+        <w:t>5 Mini) at [9/4/2025]</w:t>
+      </w:r>
+    </w:p>
+    <w:p>
+      <w:pPr>
+        <w:rPr>
+          <w:rFonts w:ascii="Roboto Mono" w:hAnsi="Roboto Mono"/>
+          <w:lang w:val="en-US"/>
+        </w:rPr>
+      </w:pPr>
+      <w:r>
+        <w:rPr>
+          <w:rFonts w:ascii="Roboto Mono" w:hAnsi="Roboto Mono"/>
+          <w:b/>
+          <w:bCs/>
+          <w:lang w:val="en-US"/>
+        </w:rPr>
+        <w:t>Project:</w:t>
+      </w:r>
+      <w:r>
+        <w:rPr>
+          <w:rFonts w:ascii="Roboto Mono" w:hAnsi="Roboto Mono"/>
+          <w:lang w:val="en-US"/>
+        </w:rPr>
+        <w:t xml:space="preserve"> Online Banking App</w:t>
       </w:r>
     </w:p>
     <w:p>
@@ -881,31 +1292,9 @@
       <w:r>
         <w:rPr>
           <w:rFonts w:ascii="Roboto Mono" w:hAnsi="Roboto Mono"/>
-          <w:b/>
-          <w:bCs/>
-          <w:lang w:val="en-US"/>
-        </w:rPr>
-        <w:lastRenderedPageBreak/>
-        <w:t>Test Execution Results</w:t>
-      </w:r>
-    </w:p>
-    <w:p>
-      <w:pPr>
-        <w:numPr>
-          <w:ilvl w:val="1"/>
-          <w:numId w:val="5"/>
-        </w:numPr>
-        <w:rPr>
-          <w:rFonts w:ascii="Roboto Mono" w:hAnsi="Roboto Mono"/>
-          <w:lang w:val="en-US"/>
-        </w:rPr>
-      </w:pPr>
-      <w:r>
-        <w:rPr>
-          <w:rFonts w:ascii="Roboto Mono" w:hAnsi="Roboto Mono"/>
-          <w:lang w:val="en-US"/>
-        </w:rPr>
-        <w:t>Number of test cases passed, failed, or blocked.</w:t>
+          <w:lang w:val="en-US"/>
+        </w:rPr>
+        <w:t>Test Execution: 95% test cases passed</w:t>
       </w:r>
     </w:p>
     <w:p>
@@ -922,49 +1311,9 @@
       <w:r>
         <w:rPr>
           <w:rFonts w:ascii="Roboto Mono" w:hAnsi="Roboto Mono"/>
-          <w:b/>
-          <w:bCs/>
-          <w:lang w:val="en-US"/>
-        </w:rPr>
-        <w:t>Defects Found</w:t>
-      </w:r>
-    </w:p>
-    <w:p>
-      <w:pPr>
-        <w:numPr>
-          <w:ilvl w:val="1"/>
-          <w:numId w:val="5"/>
-        </w:numPr>
-        <w:rPr>
-          <w:rFonts w:ascii="Roboto Mono" w:hAnsi="Roboto Mono"/>
-          <w:lang w:val="en-US"/>
-        </w:rPr>
-      </w:pPr>
-      <w:r>
-        <w:rPr>
-          <w:rFonts w:ascii="Roboto Mono" w:hAnsi="Roboto Mono"/>
-          <w:lang w:val="en-US"/>
-        </w:rPr>
-        <w:t>Number of critical, major, and minor defects.</w:t>
-      </w:r>
-    </w:p>
-    <w:p>
-      <w:pPr>
-        <w:numPr>
-          <w:ilvl w:val="1"/>
-          <w:numId w:val="5"/>
-        </w:numPr>
-        <w:rPr>
-          <w:rFonts w:ascii="Roboto Mono" w:hAnsi="Roboto Mono"/>
-          <w:lang w:val="en-US"/>
-        </w:rPr>
-      </w:pPr>
-      <w:r>
-        <w:rPr>
-          <w:rFonts w:ascii="Roboto Mono" w:hAnsi="Roboto Mono"/>
-          <w:lang w:val="en-US"/>
-        </w:rPr>
-        <w:t>Severity and impact of defects on the system.</w:t>
+          <w:lang w:val="en-US"/>
+        </w:rPr>
+        <w:t>Defects: 2 critical, 3 major open</w:t>
       </w:r>
     </w:p>
     <w:p>
@@ -981,49 +1330,9 @@
       <w:r>
         <w:rPr>
           <w:rFonts w:ascii="Roboto Mono" w:hAnsi="Roboto Mono"/>
-          <w:b/>
-          <w:bCs/>
-          <w:lang w:val="en-US"/>
-        </w:rPr>
-        <w:t>Coverage Metrics</w:t>
-      </w:r>
-    </w:p>
-    <w:p>
-      <w:pPr>
-        <w:numPr>
-          <w:ilvl w:val="1"/>
-          <w:numId w:val="5"/>
-        </w:numPr>
-        <w:rPr>
-          <w:rFonts w:ascii="Roboto Mono" w:hAnsi="Roboto Mono"/>
-          <w:lang w:val="en-US"/>
-        </w:rPr>
-      </w:pPr>
-      <w:r>
-        <w:rPr>
-          <w:rFonts w:ascii="Roboto Mono" w:hAnsi="Roboto Mono"/>
-          <w:lang w:val="en-US"/>
-        </w:rPr>
-        <w:t>Percentage of requirements, code, or features tested.</w:t>
-      </w:r>
-    </w:p>
-    <w:p>
-      <w:pPr>
-        <w:numPr>
-          <w:ilvl w:val="1"/>
-          <w:numId w:val="5"/>
-        </w:numPr>
-        <w:rPr>
-          <w:rFonts w:ascii="Roboto Mono" w:hAnsi="Roboto Mono"/>
-          <w:lang w:val="en-US"/>
-        </w:rPr>
-      </w:pPr>
-      <w:r>
-        <w:rPr>
-          <w:rFonts w:ascii="Roboto Mono" w:hAnsi="Roboto Mono"/>
-          <w:lang w:val="en-US"/>
-        </w:rPr>
-        <w:t>How much of the high-risk functionality has been covered.</w:t>
+          <w:lang w:val="en-US"/>
+        </w:rPr>
+        <w:t>Coverage: 100% of critical requirements tested</w:t>
       </w:r>
     </w:p>
     <w:p>
@@ -1040,84 +1349,55 @@
       <w:r>
         <w:rPr>
           <w:rFonts w:ascii="Roboto Mono" w:hAnsi="Roboto Mono"/>
+          <w:lang w:val="en-US"/>
+        </w:rPr>
+        <w:t>Risk: Payment module under high load not fully tested</w:t>
+      </w:r>
+    </w:p>
+    <w:p>
+      <w:pPr>
+        <w:rPr>
+          <w:rFonts w:ascii="Roboto Mono" w:hAnsi="Roboto Mono"/>
+          <w:lang w:val="en-US"/>
+        </w:rPr>
+      </w:pPr>
+      <w:r>
+        <w:rPr>
+          <w:rFonts w:ascii="Roboto Mono" w:hAnsi="Roboto Mono"/>
           <w:b/>
           <w:bCs/>
           <w:lang w:val="en-US"/>
         </w:rPr>
-        <w:t>Risk Assessment</w:t>
-      </w:r>
-    </w:p>
-    <w:p>
-      <w:pPr>
-        <w:numPr>
-          <w:ilvl w:val="1"/>
-          <w:numId w:val="5"/>
-        </w:numPr>
-        <w:rPr>
-          <w:rFonts w:ascii="Roboto Mono" w:hAnsi="Roboto Mono"/>
-          <w:lang w:val="en-US"/>
-        </w:rPr>
-      </w:pPr>
-      <w:r>
-        <w:rPr>
-          <w:rFonts w:ascii="Roboto Mono" w:hAnsi="Roboto Mono"/>
-          <w:lang w:val="en-US"/>
-        </w:rPr>
-        <w:t>Are there unresolved risks that may affect the product?</w:t>
-      </w:r>
-    </w:p>
-    <w:p>
-      <w:pPr>
-        <w:numPr>
-          <w:ilvl w:val="0"/>
-          <w:numId w:val="5"/>
-        </w:numPr>
-        <w:rPr>
-          <w:rFonts w:ascii="Roboto Mono" w:hAnsi="Roboto Mono"/>
-          <w:lang w:val="en-US"/>
-        </w:rPr>
-      </w:pPr>
-      <w:r>
-        <w:rPr>
-          <w:rFonts w:ascii="Roboto Mono" w:hAnsi="Roboto Mono"/>
-          <w:b/>
-          <w:bCs/>
-          <w:lang w:val="en-US"/>
-        </w:rPr>
-        <w:t>Compliance with Standards</w:t>
-      </w:r>
-    </w:p>
-    <w:p>
-      <w:pPr>
-        <w:numPr>
-          <w:ilvl w:val="1"/>
-          <w:numId w:val="5"/>
-        </w:numPr>
-        <w:rPr>
-          <w:rFonts w:ascii="Roboto Mono" w:hAnsi="Roboto Mono"/>
-          <w:lang w:val="en-US"/>
-        </w:rPr>
-      </w:pPr>
-      <w:r>
-        <w:rPr>
-          <w:rFonts w:ascii="Roboto Mono" w:hAnsi="Roboto Mono"/>
-          <w:lang w:val="en-US"/>
-        </w:rPr>
-        <w:t>Does the product meet functional, security, performance, and regulatory requirements?</w:t>
-      </w:r>
-    </w:p>
-    <w:p>
-      <w:pPr>
-        <w:rPr>
-          <w:lang w:val="en-US"/>
-        </w:rPr>
-      </w:pPr>
-      <w:r>
-        <w:rPr>
-          <w:lang w:val="en-US"/>
-        </w:rPr>
-        <w:pict w14:anchorId="4C382836">
-          <v:rect id="_x0000_i1063" style="width:0;height:1.5pt" o:hralign="center" o:hrstd="t" o:hr="t" fillcolor="#a0a0a0" stroked="f"/>
+        <w:t>Quality Status:</w:t>
+      </w:r>
+    </w:p>
+    <w:p>
+      <w:pPr>
+        <w:rPr>
+          <w:rFonts w:ascii="Roboto Mono" w:hAnsi="Roboto Mono"/>
+          <w:lang w:val="en-US"/>
+        </w:rPr>
+      </w:pPr>
+      <w:r>
+        <w:rPr>
+          <w:rFonts w:ascii="Roboto Mono" w:hAnsi="Roboto Mono"/>
+          <w:lang w:val="en-US"/>
+        </w:rPr>
+        <w:t>Moderate – core functionality works, but some critical issues remain; not yet ready for production.</w:t>
+      </w:r>
+    </w:p>
+    <w:p>
+      <w:pPr>
+        <w:rPr>
+          <w:lang w:val="en-US"/>
+        </w:rPr>
+      </w:pPr>
+      <w:r>
+        <w:rPr>
+          <w:lang w:val="en-US"/>
+        </w:rPr>
+        <w:pict w14:anchorId="7C046DE8">
+          <v:rect id="_x0000_i1029" style="width:0;height:1.5pt" o:hralign="center" o:hrstd="t" o:hr="t" fillcolor="#a0a0a0" stroked="f"/>
         </w:pict>
       </w:r>
     </w:p>
@@ -1133,13 +1413,13 @@
           <w:rFonts w:ascii="Segoe UI Emoji" w:hAnsi="Segoe UI Emoji" w:cs="Segoe UI Emoji"/>
           <w:lang w:val="en-US"/>
         </w:rPr>
-        <w:t>🔹</w:t>
-      </w:r>
-      <w:r>
-        <w:rPr>
-          <w:lang w:val="en-US"/>
-        </w:rPr>
-        <w:t xml:space="preserve"> Example of Quality Status</w:t>
+        <w:t>💡</w:t>
+      </w:r>
+      <w:r>
+        <w:rPr>
+          <w:lang w:val="en-US"/>
+        </w:rPr>
+        <w:t xml:space="preserve"> Key point:</w:t>
       </w:r>
     </w:p>
     <w:p>
@@ -1173,328 +1453,17 @@
           <w:szCs w:val="14"/>
           <w:shd w:val="clear" w:color="auto" w:fill="B7B7B7"/>
         </w:rPr>
-        <w:t>(GPT-5-Standard) at [9/4/2025]</w:t>
-      </w:r>
-    </w:p>
-    <w:p>
-      <w:pPr>
-        <w:rPr>
-          <w:rFonts w:ascii="Roboto Mono" w:hAnsi="Roboto Mono"/>
-          <w:lang w:val="en-US"/>
-        </w:rPr>
-      </w:pPr>
-      <w:r>
-        <w:rPr>
-          <w:rFonts w:ascii="Roboto Mono" w:hAnsi="Roboto Mono"/>
-          <w:b/>
-          <w:bCs/>
-          <w:lang w:val="en-US"/>
-        </w:rPr>
-        <w:t>Project:</w:t>
-      </w:r>
-      <w:r>
-        <w:rPr>
-          <w:rFonts w:ascii="Roboto Mono" w:hAnsi="Roboto Mono"/>
-          <w:lang w:val="en-US"/>
-        </w:rPr>
-        <w:t xml:space="preserve"> Online Banking App</w:t>
-      </w:r>
-    </w:p>
-    <w:p>
-      <w:pPr>
-        <w:numPr>
-          <w:ilvl w:val="0"/>
-          <w:numId w:val="6"/>
-        </w:numPr>
-        <w:rPr>
-          <w:rFonts w:ascii="Roboto Mono" w:hAnsi="Roboto Mono"/>
-          <w:lang w:val="en-US"/>
-        </w:rPr>
-      </w:pPr>
-      <w:r>
-        <w:rPr>
-          <w:rFonts w:ascii="Roboto Mono" w:hAnsi="Roboto Mono"/>
-          <w:lang w:val="en-US"/>
-        </w:rPr>
-        <w:t>Test Execution: 95% test cases passed</w:t>
-      </w:r>
-    </w:p>
-    <w:p>
-      <w:pPr>
-        <w:numPr>
-          <w:ilvl w:val="0"/>
-          <w:numId w:val="6"/>
-        </w:numPr>
-        <w:rPr>
-          <w:rFonts w:ascii="Roboto Mono" w:hAnsi="Roboto Mono"/>
-          <w:lang w:val="en-US"/>
-        </w:rPr>
-      </w:pPr>
-      <w:r>
-        <w:rPr>
-          <w:rFonts w:ascii="Roboto Mono" w:hAnsi="Roboto Mono"/>
-          <w:lang w:val="en-US"/>
-        </w:rPr>
-        <w:t>Defects: 2 critical, 3 major open</w:t>
-      </w:r>
-    </w:p>
-    <w:p>
-      <w:pPr>
-        <w:numPr>
-          <w:ilvl w:val="0"/>
-          <w:numId w:val="6"/>
-        </w:numPr>
-        <w:rPr>
-          <w:rFonts w:ascii="Roboto Mono" w:hAnsi="Roboto Mono"/>
-          <w:lang w:val="en-US"/>
-        </w:rPr>
-      </w:pPr>
-      <w:r>
-        <w:rPr>
-          <w:rFonts w:ascii="Roboto Mono" w:hAnsi="Roboto Mono"/>
-          <w:lang w:val="en-US"/>
-        </w:rPr>
-        <w:t>Coverage: 100% of critical requirements tested</w:t>
-      </w:r>
-    </w:p>
-    <w:p>
-      <w:pPr>
-        <w:numPr>
-          <w:ilvl w:val="0"/>
-          <w:numId w:val="6"/>
-        </w:numPr>
-        <w:rPr>
-          <w:rFonts w:ascii="Roboto Mono" w:hAnsi="Roboto Mono"/>
-          <w:lang w:val="en-US"/>
-        </w:rPr>
-      </w:pPr>
-      <w:r>
-        <w:rPr>
-          <w:rFonts w:ascii="Roboto Mono" w:hAnsi="Roboto Mono"/>
-          <w:lang w:val="en-US"/>
-        </w:rPr>
-        <w:t>Risk: Payment module under high load not fully tested</w:t>
-      </w:r>
-    </w:p>
-    <w:p>
-      <w:pPr>
-        <w:rPr>
-          <w:rFonts w:ascii="Roboto Mono" w:hAnsi="Roboto Mono"/>
-          <w:lang w:val="en-US"/>
-        </w:rPr>
-      </w:pPr>
-      <w:r>
-        <w:rPr>
-          <w:rFonts w:ascii="Roboto Mono" w:hAnsi="Roboto Mono"/>
-          <w:b/>
-          <w:bCs/>
-          <w:lang w:val="en-US"/>
-        </w:rPr>
-        <w:t>Quality Status:</w:t>
-      </w:r>
-    </w:p>
-    <w:p>
-      <w:pPr>
-        <w:rPr>
-          <w:rFonts w:ascii="Roboto Mono" w:hAnsi="Roboto Mono"/>
-          <w:lang w:val="en-US"/>
-        </w:rPr>
-      </w:pPr>
-      <w:r>
-        <w:rPr>
-          <w:rFonts w:ascii="Roboto Mono" w:hAnsi="Roboto Mono"/>
-          <w:lang w:val="en-US"/>
-        </w:rPr>
-        <w:t>Moderate – core functionality works, but some critical issues remain; not yet ready for production.</w:t>
-      </w:r>
-    </w:p>
-    <w:p>
-      <w:pPr>
-        <w:rPr>
-          <w:lang w:val="en-US"/>
-        </w:rPr>
-      </w:pPr>
-      <w:r>
-        <w:rPr>
-          <w:lang w:val="en-US"/>
-        </w:rPr>
-        <w:pict w14:anchorId="216B842C">
-          <v:rect id="_x0000_i1064" style="width:0;height:1.5pt" o:hralign="center" o:hrstd="t" o:hr="t" fillcolor="#a0a0a0" stroked="f"/>
-        </w:pict>
-      </w:r>
-    </w:p>
-    <w:p>
-      <w:pPr>
-        <w:pStyle w:val="Heading3"/>
-        <w:rPr>
-          <w:lang w:val="en-US"/>
-        </w:rPr>
-      </w:pPr>
-      <w:r>
-        <w:rPr>
-          <w:rFonts w:ascii="Segoe UI Emoji" w:hAnsi="Segoe UI Emoji" w:cs="Segoe UI Emoji"/>
-          <w:lang w:val="en-US"/>
-        </w:rPr>
-        <w:t>💡</w:t>
-      </w:r>
-      <w:r>
-        <w:rPr>
-          <w:lang w:val="en-US"/>
-        </w:rPr>
-        <w:t xml:space="preserve"> Key point:</w:t>
-      </w:r>
-    </w:p>
-    <w:p>
-      <w:pPr>
-        <w:spacing w:before="240" w:after="240"/>
-      </w:pPr>
-      <w:r>
-        <w:rPr>
-          <w:b/>
-          <w:shd w:val="clear" w:color="auto" w:fill="B7B7B7"/>
-        </w:rPr>
-        <w:t># Source</w:t>
-      </w:r>
-      <w:r>
-        <w:rPr>
-          <w:shd w:val="clear" w:color="auto" w:fill="B7B7B7"/>
-        </w:rPr>
-        <w:t xml:space="preserve">: </w:t>
-      </w:r>
-      <w:r>
-        <w:rPr>
-          <w:b/>
-          <w:shd w:val="clear" w:color="auto" w:fill="B7B7B7"/>
-        </w:rPr>
-        <w:t xml:space="preserve">Chatgpt </w:t>
-      </w:r>
-      <w:r>
-        <w:rPr>
+        <w:t>(GPT</w:t>
+      </w:r>
+      <w:r>
+        <w:rPr>
+          <w:rFonts w:ascii="Cambria Math" w:hAnsi="Cambria Math" w:cs="Cambria Math"/>
           <w:b/>
           <w:sz w:val="14"/>
           <w:szCs w:val="14"/>
           <w:shd w:val="clear" w:color="auto" w:fill="B7B7B7"/>
         </w:rPr>
-        <w:t>(GPT-5-Standard) at [9/4/2025]</w:t>
-      </w:r>
-    </w:p>
-    <w:p>
-      <w:pPr>
-        <w:spacing w:before="240" w:after="240"/>
-        <w:rPr>
-          <w:rFonts w:ascii="Roboto Mono" w:hAnsi="Roboto Mono"/>
-        </w:rPr>
-      </w:pPr>
-      <w:r>
-        <w:rPr>
-          <w:rFonts w:ascii="Roboto Mono" w:hAnsi="Roboto Mono"/>
-          <w:lang w:val="en-US"/>
-        </w:rPr>
-        <w:t xml:space="preserve">Quality Status is </w:t>
-      </w:r>
-      <w:r>
-        <w:rPr>
-          <w:rFonts w:ascii="Roboto Mono" w:hAnsi="Roboto Mono"/>
-          <w:b/>
-          <w:bCs/>
-          <w:lang w:val="en-US"/>
-        </w:rPr>
-        <w:t>a snapshot of software quality at a given time</w:t>
-      </w:r>
-      <w:r>
-        <w:rPr>
-          <w:rFonts w:ascii="Roboto Mono" w:hAnsi="Roboto Mono"/>
-          <w:lang w:val="en-US"/>
-        </w:rPr>
-        <w:t xml:space="preserve">, helping decision-makers evaluate </w:t>
-      </w:r>
-      <w:r>
-        <w:rPr>
-          <w:rFonts w:ascii="Roboto Mono" w:hAnsi="Roboto Mono"/>
-          <w:b/>
-          <w:bCs/>
-          <w:lang w:val="en-US"/>
-        </w:rPr>
-        <w:t>release readiness</w:t>
-      </w:r>
-      <w:r>
-        <w:rPr>
-          <w:rFonts w:ascii="Roboto Mono" w:hAnsi="Roboto Mono"/>
-          <w:lang w:val="en-US"/>
-        </w:rPr>
-        <w:t xml:space="preserve"> and </w:t>
-      </w:r>
-      <w:r>
-        <w:rPr>
-          <w:rFonts w:ascii="Roboto Mono" w:hAnsi="Roboto Mono"/>
-          <w:b/>
-          <w:bCs/>
-          <w:lang w:val="en-US"/>
-        </w:rPr>
-        <w:t>risk levels</w:t>
-      </w:r>
-      <w:r>
-        <w:rPr>
-          <w:rFonts w:ascii="Roboto Mono" w:hAnsi="Roboto Mono"/>
-          <w:lang w:val="en-US"/>
-        </w:rPr>
-        <w:t>.</w:t>
-      </w:r>
-    </w:p>
-    <w:p>
-      <w:pPr>
-        <w:rPr>
-          <w:lang w:val="en-US"/>
-        </w:rPr>
-      </w:pPr>
-      <w:r>
-        <w:rPr>
-          <w:lang w:val="en-US"/>
-        </w:rPr>
-        <w:pict w14:anchorId="34BA5CAF">
-          <v:rect id="_x0000_i1065" style="width:0;height:1.5pt" o:hralign="center" o:hrstd="t" o:hr="t" fillcolor="#a0a0a0" stroked="f"/>
-        </w:pict>
-      </w:r>
-    </w:p>
-    <w:p>
-      <w:pPr>
-        <w:rPr>
-          <w:lang w:val="en-US"/>
-        </w:rPr>
-      </w:pPr>
-    </w:p>
-    <w:p>
-      <w:pPr>
-        <w:pStyle w:val="Heading3"/>
-      </w:pPr>
-      <w:r>
-        <w:lastRenderedPageBreak/>
-        <w:t>is Quality Status is same Evaluating quality</w:t>
-      </w:r>
-    </w:p>
-    <w:p>
-      <w:pPr>
-        <w:spacing w:before="240" w:after="240"/>
-      </w:pPr>
-      <w:r>
-        <w:rPr>
-          <w:b/>
-          <w:shd w:val="clear" w:color="auto" w:fill="B7B7B7"/>
-        </w:rPr>
-        <w:t># Source</w:t>
-      </w:r>
-      <w:r>
-        <w:rPr>
-          <w:shd w:val="clear" w:color="auto" w:fill="B7B7B7"/>
-        </w:rPr>
-        <w:t xml:space="preserve">: </w:t>
-      </w:r>
-      <w:r>
-        <w:rPr>
-          <w:b/>
-          <w:shd w:val="clear" w:color="auto" w:fill="B7B7B7"/>
-        </w:rPr>
-        <w:t xml:space="preserve">Chatgpt </w:t>
+        <w:t>‑</w:t>
       </w:r>
       <w:r>
         <w:rPr>
@@ -1503,21 +1472,168 @@
           <w:szCs w:val="14"/>
           <w:shd w:val="clear" w:color="auto" w:fill="B7B7B7"/>
         </w:rPr>
-        <w:t>(GPT-5-Standard) at [9/4/2025]</w:t>
-      </w:r>
-    </w:p>
-    <w:p>
-      <w:pPr>
-        <w:rPr>
-          <w:rFonts w:ascii="Roboto Mono" w:hAnsi="Roboto Mono"/>
-          <w:lang w:val="en-US"/>
-        </w:rPr>
-      </w:pPr>
-      <w:r>
-        <w:rPr>
-          <w:rFonts w:ascii="Roboto Mono" w:hAnsi="Roboto Mono"/>
-          <w:lang w:val="en-US"/>
-        </w:rPr>
+        <w:t>5 Mini) at [9/4/2025]</w:t>
+      </w:r>
+    </w:p>
+    <w:p>
+      <w:pPr>
+        <w:spacing w:before="240" w:after="240"/>
+        <w:rPr>
+          <w:rFonts w:ascii="Roboto Mono" w:hAnsi="Roboto Mono"/>
+        </w:rPr>
+      </w:pPr>
+      <w:r>
+        <w:rPr>
+          <w:rFonts w:ascii="Roboto Mono" w:hAnsi="Roboto Mono"/>
+          <w:lang w:val="en-US"/>
+        </w:rPr>
+        <w:t xml:space="preserve">Quality Status is </w:t>
+      </w:r>
+      <w:r>
+        <w:rPr>
+          <w:rFonts w:ascii="Roboto Mono" w:hAnsi="Roboto Mono"/>
+          <w:b/>
+          <w:bCs/>
+          <w:lang w:val="en-US"/>
+        </w:rPr>
+        <w:t>a snapshot of software quality at a given time</w:t>
+      </w:r>
+      <w:r>
+        <w:rPr>
+          <w:rFonts w:ascii="Roboto Mono" w:hAnsi="Roboto Mono"/>
+          <w:lang w:val="en-US"/>
+        </w:rPr>
+        <w:t xml:space="preserve">, helping decision-makers evaluate </w:t>
+      </w:r>
+      <w:r>
+        <w:rPr>
+          <w:rFonts w:ascii="Roboto Mono" w:hAnsi="Roboto Mono"/>
+          <w:b/>
+          <w:bCs/>
+          <w:lang w:val="en-US"/>
+        </w:rPr>
+        <w:t>release readiness</w:t>
+      </w:r>
+      <w:r>
+        <w:rPr>
+          <w:rFonts w:ascii="Roboto Mono" w:hAnsi="Roboto Mono"/>
+          <w:lang w:val="en-US"/>
+        </w:rPr>
+        <w:t xml:space="preserve"> and </w:t>
+      </w:r>
+      <w:r>
+        <w:rPr>
+          <w:rFonts w:ascii="Roboto Mono" w:hAnsi="Roboto Mono"/>
+          <w:b/>
+          <w:bCs/>
+          <w:lang w:val="en-US"/>
+        </w:rPr>
+        <w:t>risk levels</w:t>
+      </w:r>
+      <w:r>
+        <w:rPr>
+          <w:rFonts w:ascii="Roboto Mono" w:hAnsi="Roboto Mono"/>
+          <w:lang w:val="en-US"/>
+        </w:rPr>
+        <w:t>.</w:t>
+      </w:r>
+    </w:p>
+    <w:p>
+      <w:pPr>
+        <w:rPr>
+          <w:lang w:val="en-US"/>
+        </w:rPr>
+      </w:pPr>
+      <w:r>
+        <w:rPr>
+          <w:lang w:val="en-US"/>
+        </w:rPr>
+        <w:pict w14:anchorId="50F9540B">
+          <v:rect id="_x0000_i1030" style="width:0;height:1.5pt" o:hralign="center" o:hrstd="t" o:hr="t" fillcolor="#a0a0a0" stroked="f"/>
+        </w:pict>
+      </w:r>
+    </w:p>
+    <w:p>
+      <w:pPr>
+        <w:rPr>
+          <w:lang w:val="en-US"/>
+        </w:rPr>
+      </w:pPr>
+    </w:p>
+    <w:p>
+      <w:pPr>
+        <w:pStyle w:val="Heading3"/>
+      </w:pPr>
+      <w:r>
+        <w:t>is Quality Status is same Evaluating quality</w:t>
+      </w:r>
+    </w:p>
+    <w:p>
+      <w:pPr>
+        <w:spacing w:before="240" w:after="240"/>
+      </w:pPr>
+      <w:r>
+        <w:rPr>
+          <w:b/>
+          <w:shd w:val="clear" w:color="auto" w:fill="B7B7B7"/>
+        </w:rPr>
+        <w:t># Source</w:t>
+      </w:r>
+      <w:r>
+        <w:rPr>
+          <w:shd w:val="clear" w:color="auto" w:fill="B7B7B7"/>
+        </w:rPr>
+        <w:t xml:space="preserve">: </w:t>
+      </w:r>
+      <w:r>
+        <w:rPr>
+          <w:b/>
+          <w:shd w:val="clear" w:color="auto" w:fill="B7B7B7"/>
+        </w:rPr>
+        <w:t xml:space="preserve">Chatgpt </w:t>
+      </w:r>
+      <w:r>
+        <w:rPr>
+          <w:b/>
+          <w:sz w:val="14"/>
+          <w:szCs w:val="14"/>
+          <w:shd w:val="clear" w:color="auto" w:fill="B7B7B7"/>
+        </w:rPr>
+        <w:t>(GPT</w:t>
+      </w:r>
+      <w:r>
+        <w:rPr>
+          <w:rFonts w:ascii="Cambria Math" w:hAnsi="Cambria Math" w:cs="Cambria Math"/>
+          <w:b/>
+          <w:sz w:val="14"/>
+          <w:szCs w:val="14"/>
+          <w:shd w:val="clear" w:color="auto" w:fill="B7B7B7"/>
+        </w:rPr>
+        <w:t>‑</w:t>
+      </w:r>
+      <w:r>
+        <w:rPr>
+          <w:b/>
+          <w:sz w:val="14"/>
+          <w:szCs w:val="14"/>
+          <w:shd w:val="clear" w:color="auto" w:fill="B7B7B7"/>
+        </w:rPr>
+        <w:t>5 Mini) at [9/4/2025]</w:t>
+      </w:r>
+    </w:p>
+    <w:p>
+      <w:pPr>
+        <w:rPr>
+          <w:rFonts w:ascii="Roboto Mono" w:hAnsi="Roboto Mono"/>
+          <w:lang w:val="en-US"/>
+        </w:rPr>
+      </w:pPr>
+      <w:r>
+        <w:rPr>
+          <w:rFonts w:ascii="Roboto Mono" w:hAnsi="Roboto Mono"/>
+          <w:lang w:val="en-US"/>
+        </w:rPr>
+        <w:lastRenderedPageBreak/>
         <w:t xml:space="preserve">Not exactly — they are related but </w:t>
       </w:r>
       <w:r>
@@ -1549,8 +1665,8 @@
           <w:rFonts w:ascii="Roboto Mono" w:hAnsi="Roboto Mono"/>
           <w:lang w:val="en-US"/>
         </w:rPr>
-        <w:pict w14:anchorId="651483A4">
-          <v:rect id="_x0000_i1090" style="width:0;height:1.5pt" o:hralign="center" o:hrstd="t" o:hr="t" fillcolor="#a0a0a0" stroked="f"/>
+        <w:pict w14:anchorId="081A0018">
+          <v:rect id="_x0000_i1031" style="width:0;height:1.5pt" o:hralign="center" o:hrstd="t" o:hr="t" fillcolor="#a0a0a0" stroked="f"/>
         </w:pict>
       </w:r>
     </w:p>
@@ -1596,7 +1712,7 @@
           <w:noProof/>
         </w:rPr>
         <w:drawing>
-          <wp:inline distT="0" distB="0" distL="0" distR="0" wp14:anchorId="4BE72660" wp14:editId="715055AD">
+          <wp:inline distT="0" distB="0" distL="0" distR="0" wp14:anchorId="1FB9C8BE" wp14:editId="3556E210">
             <wp:extent cx="5943600" cy="2889250"/>
             <wp:effectExtent l="0" t="0" r="0" b="6350"/>
             <wp:docPr id="521505984" name="Picture 1"/>
@@ -2102,38 +2218,183 @@
           <w:rFonts w:ascii="Roboto Mono" w:hAnsi="Roboto Mono"/>
           <w:lang w:val="en-US"/>
         </w:rPr>
+        <w:pict w14:anchorId="688240E1">
+          <v:rect id="_x0000_i1032" style="width:0;height:1.5pt" o:hralign="center" o:hrstd="t" o:hr="t" fillcolor="#a0a0a0" stroked="f"/>
+        </w:pict>
+      </w:r>
+    </w:p>
+    <w:p>
+      <w:pPr>
+        <w:rPr>
+          <w:rFonts w:ascii="Roboto Mono" w:hAnsi="Roboto Mono"/>
+          <w:b/>
+          <w:bCs/>
+          <w:lang w:val="en-US"/>
+        </w:rPr>
+      </w:pPr>
+      <w:r>
+        <w:rPr>
+          <w:rFonts w:ascii="Segoe UI Emoji" w:hAnsi="Segoe UI Emoji" w:cs="Segoe UI Emoji"/>
+          <w:b/>
+          <w:bCs/>
+          <w:lang w:val="en-US"/>
+        </w:rPr>
+        <w:t>💡</w:t>
+      </w:r>
+      <w:r>
+        <w:rPr>
+          <w:rFonts w:ascii="Roboto Mono" w:hAnsi="Roboto Mono"/>
+          <w:b/>
+          <w:bCs/>
+          <w:lang w:val="en-US"/>
+        </w:rPr>
+        <w:t xml:space="preserve"> Key Point</w:t>
+      </w:r>
+    </w:p>
+    <w:p>
+      <w:pPr>
+        <w:numPr>
+          <w:ilvl w:val="0"/>
+          <w:numId w:val="6"/>
+        </w:numPr>
+        <w:rPr>
+          <w:rFonts w:ascii="Roboto Mono" w:hAnsi="Roboto Mono"/>
+          <w:lang w:val="en-US"/>
+        </w:rPr>
+      </w:pPr>
+      <w:r>
+        <w:rPr>
+          <w:rFonts w:ascii="Roboto Mono" w:hAnsi="Roboto Mono"/>
+          <w:b/>
+          <w:bCs/>
+          <w:lang w:val="en-US"/>
+        </w:rPr>
+        <w:t>Evaluating quality</w:t>
+      </w:r>
+      <w:r>
+        <w:rPr>
+          <w:rFonts w:ascii="Roboto Mono" w:hAnsi="Roboto Mono"/>
+          <w:lang w:val="en-US"/>
+        </w:rPr>
+        <w:t xml:space="preserve"> </w:t>
+      </w:r>
+      <w:r>
+        <w:rPr>
+          <w:lang w:val="en-US"/>
+        </w:rPr>
+        <w:t>→</w:t>
+      </w:r>
+      <w:r>
+        <w:rPr>
+          <w:rFonts w:ascii="Roboto Mono" w:hAnsi="Roboto Mono"/>
+          <w:lang w:val="en-US"/>
+        </w:rPr>
+        <w:t xml:space="preserve"> </w:t>
+      </w:r>
+      <w:r>
+        <w:rPr>
+          <w:rFonts w:ascii="Roboto Mono" w:hAnsi="Roboto Mono"/>
+          <w:i/>
+          <w:iCs/>
+          <w:lang w:val="en-US"/>
+        </w:rPr>
+        <w:t>what we do</w:t>
+      </w:r>
+      <w:r>
+        <w:rPr>
+          <w:rFonts w:ascii="Roboto Mono" w:hAnsi="Roboto Mono"/>
+          <w:lang w:val="en-US"/>
+        </w:rPr>
+        <w:t>: analysis and assessment.</w:t>
+      </w:r>
+    </w:p>
+    <w:p>
+      <w:pPr>
+        <w:numPr>
+          <w:ilvl w:val="0"/>
+          <w:numId w:val="6"/>
+        </w:numPr>
+        <w:rPr>
+          <w:rFonts w:ascii="Roboto Mono" w:hAnsi="Roboto Mono"/>
+          <w:lang w:val="en-US"/>
+        </w:rPr>
+      </w:pPr>
+      <w:r>
+        <w:rPr>
+          <w:rFonts w:ascii="Roboto Mono" w:hAnsi="Roboto Mono"/>
+          <w:b/>
+          <w:bCs/>
+          <w:lang w:val="en-US"/>
+        </w:rPr>
         <w:lastRenderedPageBreak/>
-        <w:pict w14:anchorId="5F0B0790">
-          <v:rect id="_x0000_i1091" style="width:0;height:1.5pt" o:hralign="center" o:hrstd="t" o:hr="t" fillcolor="#a0a0a0" stroked="f"/>
-        </w:pict>
-      </w:r>
-    </w:p>
-    <w:p>
-      <w:pPr>
+        <w:t>Quality status</w:t>
+      </w:r>
+      <w:r>
+        <w:rPr>
+          <w:rFonts w:ascii="Roboto Mono" w:hAnsi="Roboto Mono"/>
+          <w:lang w:val="en-US"/>
+        </w:rPr>
+        <w:t xml:space="preserve"> </w:t>
+      </w:r>
+      <w:r>
+        <w:rPr>
+          <w:lang w:val="en-US"/>
+        </w:rPr>
+        <w:t>→</w:t>
+      </w:r>
+      <w:r>
+        <w:rPr>
+          <w:rFonts w:ascii="Roboto Mono" w:hAnsi="Roboto Mono"/>
+          <w:lang w:val="en-US"/>
+        </w:rPr>
+        <w:t xml:space="preserve"> </w:t>
+      </w:r>
+      <w:r>
+        <w:rPr>
+          <w:rFonts w:ascii="Roboto Mono" w:hAnsi="Roboto Mono"/>
+          <w:i/>
+          <w:iCs/>
+          <w:lang w:val="en-US"/>
+        </w:rPr>
+        <w:t>what we get</w:t>
+      </w:r>
+      <w:r>
+        <w:rPr>
+          <w:rFonts w:ascii="Roboto Mono" w:hAnsi="Roboto Mono"/>
+          <w:lang w:val="en-US"/>
+        </w:rPr>
+        <w:t>: the outcome of that evaluation at a particular time.</w:t>
+      </w:r>
+    </w:p>
+    <w:p>
+      <w:pPr>
+        <w:rPr>
+          <w:rFonts w:ascii="Roboto Mono" w:hAnsi="Roboto Mono"/>
+          <w:lang w:val="en-US"/>
+        </w:rPr>
+      </w:pPr>
+      <w:r>
+        <w:rPr>
+          <w:rFonts w:ascii="Roboto Mono" w:hAnsi="Roboto Mono"/>
+          <w:lang w:val="en-US"/>
+        </w:rPr>
+        <w:t xml:space="preserve">Think of it like a </w:t>
+      </w:r>
+      <w:r>
         <w:rPr>
           <w:rFonts w:ascii="Roboto Mono" w:hAnsi="Roboto Mono"/>
           <w:b/>
           <w:bCs/>
           <w:lang w:val="en-US"/>
         </w:rPr>
-      </w:pPr>
-      <w:r>
-        <w:rPr>
-          <w:rFonts w:ascii="Segoe UI Emoji" w:hAnsi="Segoe UI Emoji" w:cs="Segoe UI Emoji"/>
-          <w:b/>
-          <w:bCs/>
-          <w:lang w:val="en-US"/>
-        </w:rPr>
-        <w:t>💡</w:t>
-      </w:r>
-      <w:r>
-        <w:rPr>
-          <w:rFonts w:ascii="Roboto Mono" w:hAnsi="Roboto Mono"/>
-          <w:b/>
-          <w:bCs/>
-          <w:lang w:val="en-US"/>
-        </w:rPr>
-        <w:t xml:space="preserve"> Key Point</w:t>
+        <w:t>health check</w:t>
+      </w:r>
+      <w:r>
+        <w:rPr>
+          <w:rFonts w:ascii="Roboto Mono" w:hAnsi="Roboto Mono"/>
+          <w:lang w:val="en-US"/>
+        </w:rPr>
+        <w:t>:</w:t>
       </w:r>
     </w:p>
     <w:p>
@@ -2161,36 +2422,7 @@
           <w:rFonts w:ascii="Roboto Mono" w:hAnsi="Roboto Mono"/>
           <w:lang w:val="en-US"/>
         </w:rPr>
-        <w:t xml:space="preserve"> </w:t>
-      </w:r>
-      <w:r>
-        <w:rPr>
-          <w:lang w:val="en-US"/>
-        </w:rPr>
-        <w:t>→</w:t>
-      </w:r>
-      <w:r>
-        <w:rPr>
-          <w:rFonts w:ascii="Roboto Mono" w:hAnsi="Roboto Mono"/>
-          <w:lang w:val="en-US"/>
-        </w:rPr>
-        <w:t xml:space="preserve"> </w:t>
-      </w:r>
-      <w:r>
-        <w:rPr>
-          <w:rFonts w:ascii="Roboto Mono" w:hAnsi="Roboto Mono"/>
-          <w:i/>
-          <w:iCs/>
-          <w:lang w:val="en-US"/>
-        </w:rPr>
-        <w:t>what we do</w:t>
-      </w:r>
-      <w:r>
-        <w:rPr>
-          <w:rFonts w:ascii="Roboto Mono" w:hAnsi="Roboto Mono"/>
-          <w:lang w:val="en-US"/>
-        </w:rPr>
-        <w:t>: analysis and assessment.</w:t>
+        <w:t xml:space="preserve"> = the doctor examining you, taking tests.</w:t>
       </w:r>
     </w:p>
     <w:p>
@@ -2218,122 +2450,6 @@
           <w:rFonts w:ascii="Roboto Mono" w:hAnsi="Roboto Mono"/>
           <w:lang w:val="en-US"/>
         </w:rPr>
-        <w:t xml:space="preserve"> </w:t>
-      </w:r>
-      <w:r>
-        <w:rPr>
-          <w:lang w:val="en-US"/>
-        </w:rPr>
-        <w:t>→</w:t>
-      </w:r>
-      <w:r>
-        <w:rPr>
-          <w:rFonts w:ascii="Roboto Mono" w:hAnsi="Roboto Mono"/>
-          <w:lang w:val="en-US"/>
-        </w:rPr>
-        <w:t xml:space="preserve"> </w:t>
-      </w:r>
-      <w:r>
-        <w:rPr>
-          <w:rFonts w:ascii="Roboto Mono" w:hAnsi="Roboto Mono"/>
-          <w:i/>
-          <w:iCs/>
-          <w:lang w:val="en-US"/>
-        </w:rPr>
-        <w:t>what we get</w:t>
-      </w:r>
-      <w:r>
-        <w:rPr>
-          <w:rFonts w:ascii="Roboto Mono" w:hAnsi="Roboto Mono"/>
-          <w:lang w:val="en-US"/>
-        </w:rPr>
-        <w:t>: the outcome of that evaluation at a particular time.</w:t>
-      </w:r>
-    </w:p>
-    <w:p>
-      <w:pPr>
-        <w:rPr>
-          <w:rFonts w:ascii="Roboto Mono" w:hAnsi="Roboto Mono"/>
-          <w:lang w:val="en-US"/>
-        </w:rPr>
-      </w:pPr>
-      <w:r>
-        <w:rPr>
-          <w:rFonts w:ascii="Roboto Mono" w:hAnsi="Roboto Mono"/>
-          <w:lang w:val="en-US"/>
-        </w:rPr>
-        <w:t xml:space="preserve">Think of it like a </w:t>
-      </w:r>
-      <w:r>
-        <w:rPr>
-          <w:rFonts w:ascii="Roboto Mono" w:hAnsi="Roboto Mono"/>
-          <w:b/>
-          <w:bCs/>
-          <w:lang w:val="en-US"/>
-        </w:rPr>
-        <w:t>health check</w:t>
-      </w:r>
-      <w:r>
-        <w:rPr>
-          <w:rFonts w:ascii="Roboto Mono" w:hAnsi="Roboto Mono"/>
-          <w:lang w:val="en-US"/>
-        </w:rPr>
-        <w:t>:</w:t>
-      </w:r>
-    </w:p>
-    <w:p>
-      <w:pPr>
-        <w:numPr>
-          <w:ilvl w:val="0"/>
-          <w:numId w:val="8"/>
-        </w:numPr>
-        <w:rPr>
-          <w:rFonts w:ascii="Roboto Mono" w:hAnsi="Roboto Mono"/>
-          <w:lang w:val="en-US"/>
-        </w:rPr>
-      </w:pPr>
-      <w:r>
-        <w:rPr>
-          <w:rFonts w:ascii="Roboto Mono" w:hAnsi="Roboto Mono"/>
-          <w:b/>
-          <w:bCs/>
-          <w:lang w:val="en-US"/>
-        </w:rPr>
-        <w:t>Evaluating quality</w:t>
-      </w:r>
-      <w:r>
-        <w:rPr>
-          <w:rFonts w:ascii="Roboto Mono" w:hAnsi="Roboto Mono"/>
-          <w:lang w:val="en-US"/>
-        </w:rPr>
-        <w:t xml:space="preserve"> = the doctor examining you, taking tests.</w:t>
-      </w:r>
-    </w:p>
-    <w:p>
-      <w:pPr>
-        <w:numPr>
-          <w:ilvl w:val="0"/>
-          <w:numId w:val="8"/>
-        </w:numPr>
-        <w:rPr>
-          <w:rFonts w:ascii="Roboto Mono" w:hAnsi="Roboto Mono"/>
-          <w:lang w:val="en-US"/>
-        </w:rPr>
-      </w:pPr>
-      <w:r>
-        <w:rPr>
-          <w:rFonts w:ascii="Roboto Mono" w:hAnsi="Roboto Mono"/>
-          <w:b/>
-          <w:bCs/>
-          <w:lang w:val="en-US"/>
-        </w:rPr>
-        <w:t>Quality status</w:t>
-      </w:r>
-      <w:r>
-        <w:rPr>
-          <w:rFonts w:ascii="Roboto Mono" w:hAnsi="Roboto Mono"/>
-          <w:lang w:val="en-US"/>
-        </w:rPr>
         <w:t xml:space="preserve"> = the report card saying “Your health is good/moderate/poor.”</w:t>
       </w:r>
     </w:p>
@@ -2347,8 +2463,8 @@
         <w:rPr>
           <w:lang w:val="en-US"/>
         </w:rPr>
-        <w:pict w14:anchorId="452E091C">
-          <v:rect id="_x0000_i1092" style="width:0;height:1.5pt" o:hralign="center" o:hrstd="t" o:hr="t" fillcolor="#a0a0a0" stroked="f"/>
+        <w:pict w14:anchorId="67FFDF5D">
+          <v:rect id="_x0000_i1033" style="width:0;height:1.5pt" o:hralign="center" o:hrstd="t" o:hr="t" fillcolor="#a0a0a0" stroked="f"/>
         </w:pict>
       </w:r>
     </w:p>
@@ -2359,6 +2475,7 @@
         </w:rPr>
       </w:pPr>
     </w:p>
+    <w:p/>
     <w:sectPr>
       <w:pgSz w:w="12240" w:h="15840"/>
       <w:pgMar w:top="1440" w:right="1440" w:bottom="1440" w:left="1440" w:header="720" w:footer="720" w:gutter="0"/>
@@ -2371,11 +2488,6 @@
 
 <file path=word/numbering.xml><?xml version="1.0" encoding="utf-8"?>
 <w:numbering xmlns:wpc="http://schemas.microsoft.com/office/word/2010/wordprocessingCanvas" xmlns:cx="http://schemas.microsoft.com/office/drawing/2014/chartex" xmlns:cx1="http://schemas.microsoft.com/office/drawing/2015/9/8/chartex" xmlns:cx2="http://schemas.microsoft.com/office/drawing/2015/10/21/chartex" xmlns:cx3="http://schemas.microsoft.com/office/drawing/2016/5/9/chartex" xmlns:cx4="http://schemas.microsoft.com/office/drawing/2016/5/10/chartex" xmlns:cx5="http://schemas.microsoft.com/office/drawing/2016/5/11/chartex" xmlns:cx6="http://schemas.microsoft.com/office/drawing/2016/5/12/chartex" xmlns:cx7="http://schemas.microsoft.com/office/drawing/2016/5/13/chartex" xmlns:cx8="http://schemas.microsoft.com/office/drawing/2016/5/14/chartex" xmlns:mc="http://schemas.openxmlformats.org/markup-compatibility/2006" xmlns:aink="http://schemas.microsoft.com/office/drawing/2016/ink" xmlns:am3d="http://schemas.microsoft.com/office/drawing/2017/model3d" xmlns:o="urn:schemas-microsoft-com:office:office" xmlns:oel="http://schemas.microsoft.com/office/2019/extlst" xmlns:r="http://schemas.openxmlformats.org/officeDocument/2006/relationships" xmlns:m="http://schemas.openxmlformats.org/officeDocument/2006/math" xmlns:v="urn:schemas-microsoft-com:vml" xmlns:wp14="http://schemas.microsoft.com/office/word/2010/wordprocessingDrawing" xmlns:wp="http://schemas.openxmlformats.org/drawingml/2006/wordprocessingDrawing" xmlns:w10="urn:schemas-microsoft-com:office:word" xmlns:w="http://schemas.openxmlformats.org/wordprocessingml/2006/main" xmlns:w14="http://schemas.microsoft.com/office/word/2010/wordml" xmlns:w15="http://schemas.microsoft.com/office/word/2012/wordml" xmlns:w16cex="http://schemas.microsoft.com/office/word/2018/wordml/cex" xmlns:w16cid="http://schemas.microsoft.com/office/word/2016/wordml/cid" xmlns:w16="http://schemas.microsoft.com/office/word/2018/wordml" xmlns:w16du="http://schemas.microsoft.com/office/word/2023/wordml/word16du" xmlns:w16sdtdh="http://schemas.microsoft.com/office/word/2020/wordml/sdtdatahash" xmlns:w16sdtfl="http://schemas.microsoft.com/office/word/2024/wordml/sdtformatlock" xmlns:w16se="http://schemas.microsoft.com/office/word/2015/wordml/symex" xmlns:wpg="http://schemas.microsoft.com/office/word/2010/wordprocessingGroup" xmlns:wpi="http://schemas.microsoft.com/office/word/2010/wordprocessingInk" xmlns:wne="http://schemas.microsoft.com/office/word/2006/wordml" xmlns:wps="http://schemas.microsoft.com/office/word/2010/wordprocessingShape" mc:Ignorable="w14 w15 w16se w16cid w16 w16cex w16sdtdh w16sdtfl w16du wp14">
-  <w:numPicBullet w:numPicBulletId="0">
-    <w:pict>
-      <v:rect id="_x0000_i1544" style="width:0;height:1.5pt" o:hralign="center" o:bullet="t" o:hrstd="t" o:hr="t" fillcolor="#a0a0a0" stroked="f"/>
-    </w:pict>
-  </w:numPicBullet>
   <w:abstractNum w:abstractNumId="0" w15:restartNumberingAfterBreak="0">
     <w:nsid w:val="14FE0CE9"/>
     <w:multiLevelType w:val="multilevel"/>
@@ -3167,147 +3279,6 @@
     </w:lvl>
   </w:abstractNum>
   <w:abstractNum w:abstractNumId="6" w15:restartNumberingAfterBreak="0">
-    <w:nsid w:val="5276486F"/>
-    <w:multiLevelType w:val="hybridMultilevel"/>
-    <w:tmpl w:val="030ADB58"/>
-    <w:lvl w:ilvl="0" w:tplc="7A64C7BE">
-      <w:start w:val="1"/>
-      <w:numFmt w:val="bullet"/>
-      <w:lvlText w:val=""/>
-      <w:lvlPicBulletId w:val="0"/>
-      <w:lvlJc w:val="left"/>
-      <w:pPr>
-        <w:tabs>
-          <w:tab w:val="num" w:pos="720"/>
-        </w:tabs>
-        <w:ind w:left="720" w:hanging="360"/>
-      </w:pPr>
-      <w:rPr>
-        <w:rFonts w:ascii="Symbol" w:hAnsi="Symbol" w:hint="default"/>
-      </w:rPr>
-    </w:lvl>
-    <w:lvl w:ilvl="1" w:tplc="4970C90E" w:tentative="1">
-      <w:start w:val="1"/>
-      <w:numFmt w:val="bullet"/>
-      <w:lvlText w:val=""/>
-      <w:lvlJc w:val="left"/>
-      <w:pPr>
-        <w:tabs>
-          <w:tab w:val="num" w:pos="1440"/>
-        </w:tabs>
-        <w:ind w:left="1440" w:hanging="360"/>
-      </w:pPr>
-      <w:rPr>
-        <w:rFonts w:ascii="Symbol" w:hAnsi="Symbol" w:hint="default"/>
-      </w:rPr>
-    </w:lvl>
-    <w:lvl w:ilvl="2" w:tplc="D0DC1500" w:tentative="1">
-      <w:start w:val="1"/>
-      <w:numFmt w:val="bullet"/>
-      <w:lvlText w:val=""/>
-      <w:lvlJc w:val="left"/>
-      <w:pPr>
-        <w:tabs>
-          <w:tab w:val="num" w:pos="2160"/>
-        </w:tabs>
-        <w:ind w:left="2160" w:hanging="360"/>
-      </w:pPr>
-      <w:rPr>
-        <w:rFonts w:ascii="Symbol" w:hAnsi="Symbol" w:hint="default"/>
-      </w:rPr>
-    </w:lvl>
-    <w:lvl w:ilvl="3" w:tplc="18280AD2" w:tentative="1">
-      <w:start w:val="1"/>
-      <w:numFmt w:val="bullet"/>
-      <w:lvlText w:val=""/>
-      <w:lvlJc w:val="left"/>
-      <w:pPr>
-        <w:tabs>
-          <w:tab w:val="num" w:pos="2880"/>
-        </w:tabs>
-        <w:ind w:left="2880" w:hanging="360"/>
-      </w:pPr>
-      <w:rPr>
-        <w:rFonts w:ascii="Symbol" w:hAnsi="Symbol" w:hint="default"/>
-      </w:rPr>
-    </w:lvl>
-    <w:lvl w:ilvl="4" w:tplc="98F0C406" w:tentative="1">
-      <w:start w:val="1"/>
-      <w:numFmt w:val="bullet"/>
-      <w:lvlText w:val=""/>
-      <w:lvlJc w:val="left"/>
-      <w:pPr>
-        <w:tabs>
-          <w:tab w:val="num" w:pos="3600"/>
-        </w:tabs>
-        <w:ind w:left="3600" w:hanging="360"/>
-      </w:pPr>
-      <w:rPr>
-        <w:rFonts w:ascii="Symbol" w:hAnsi="Symbol" w:hint="default"/>
-      </w:rPr>
-    </w:lvl>
-    <w:lvl w:ilvl="5" w:tplc="9E161D48" w:tentative="1">
-      <w:start w:val="1"/>
-      <w:numFmt w:val="bullet"/>
-      <w:lvlText w:val=""/>
-      <w:lvlJc w:val="left"/>
-      <w:pPr>
-        <w:tabs>
-          <w:tab w:val="num" w:pos="4320"/>
-        </w:tabs>
-        <w:ind w:left="4320" w:hanging="360"/>
-      </w:pPr>
-      <w:rPr>
-        <w:rFonts w:ascii="Symbol" w:hAnsi="Symbol" w:hint="default"/>
-      </w:rPr>
-    </w:lvl>
-    <w:lvl w:ilvl="6" w:tplc="DDF219D4" w:tentative="1">
-      <w:start w:val="1"/>
-      <w:numFmt w:val="bullet"/>
-      <w:lvlText w:val=""/>
-      <w:lvlJc w:val="left"/>
-      <w:pPr>
-        <w:tabs>
-          <w:tab w:val="num" w:pos="5040"/>
-        </w:tabs>
-        <w:ind w:left="5040" w:hanging="360"/>
-      </w:pPr>
-      <w:rPr>
-        <w:rFonts w:ascii="Symbol" w:hAnsi="Symbol" w:hint="default"/>
-      </w:rPr>
-    </w:lvl>
-    <w:lvl w:ilvl="7" w:tplc="362698E6" w:tentative="1">
-      <w:start w:val="1"/>
-      <w:numFmt w:val="bullet"/>
-      <w:lvlText w:val=""/>
-      <w:lvlJc w:val="left"/>
-      <w:pPr>
-        <w:tabs>
-          <w:tab w:val="num" w:pos="5760"/>
-        </w:tabs>
-        <w:ind w:left="5760" w:hanging="360"/>
-      </w:pPr>
-      <w:rPr>
-        <w:rFonts w:ascii="Symbol" w:hAnsi="Symbol" w:hint="default"/>
-      </w:rPr>
-    </w:lvl>
-    <w:lvl w:ilvl="8" w:tplc="48A65A82" w:tentative="1">
-      <w:start w:val="1"/>
-      <w:numFmt w:val="bullet"/>
-      <w:lvlText w:val=""/>
-      <w:lvlJc w:val="left"/>
-      <w:pPr>
-        <w:tabs>
-          <w:tab w:val="num" w:pos="6480"/>
-        </w:tabs>
-        <w:ind w:left="6480" w:hanging="360"/>
-      </w:pPr>
-      <w:rPr>
-        <w:rFonts w:ascii="Symbol" w:hAnsi="Symbol" w:hint="default"/>
-      </w:rPr>
-    </w:lvl>
-  </w:abstractNum>
-  <w:abstractNum w:abstractNumId="7" w15:restartNumberingAfterBreak="0">
     <w:nsid w:val="78AF19EF"/>
     <w:multiLevelType w:val="multilevel"/>
     <w:tmpl w:val="5674371C"/>
@@ -3421,7 +3392,7 @@
     </w:lvl>
   </w:abstractNum>
   <w:num w:numId="1" w16cid:durableId="383793826">
-    <w:abstractNumId w:val="7"/>
+    <w:abstractNumId w:val="6"/>
   </w:num>
   <w:num w:numId="2" w16cid:durableId="739519525">
     <w:abstractNumId w:val="3"/>
@@ -3429,19 +3400,16 @@
   <w:num w:numId="3" w16cid:durableId="2009478652">
     <w:abstractNumId w:val="5"/>
   </w:num>
-  <w:num w:numId="4" w16cid:durableId="1408500780">
-    <w:abstractNumId w:val="6"/>
-  </w:num>
-  <w:num w:numId="5" w16cid:durableId="1591618673">
+  <w:num w:numId="4" w16cid:durableId="1591618673">
     <w:abstractNumId w:val="2"/>
   </w:num>
-  <w:num w:numId="6" w16cid:durableId="1628317955">
+  <w:num w:numId="5" w16cid:durableId="1628317955">
     <w:abstractNumId w:val="0"/>
   </w:num>
-  <w:num w:numId="7" w16cid:durableId="463889332">
+  <w:num w:numId="6" w16cid:durableId="463889332">
     <w:abstractNumId w:val="1"/>
   </w:num>
-  <w:num w:numId="8" w16cid:durableId="1212303331">
+  <w:num w:numId="7" w16cid:durableId="1212303331">
     <w:abstractNumId w:val="4"/>
   </w:num>
 </w:numbering>
@@ -3452,15 +3420,17 @@
   <w:docDefaults>
     <w:rPrDefault>
       <w:rPr>
-        <w:rFonts w:ascii="Arial" w:eastAsia="Arial" w:hAnsi="Arial" w:cs="Arial"/>
-        <w:sz w:val="22"/>
-        <w:szCs w:val="22"/>
-        <w:lang w:val="en" w:eastAsia="en-US" w:bidi="ar-SA"/>
+        <w:rFonts w:asciiTheme="minorHAnsi" w:eastAsiaTheme="minorHAnsi" w:hAnsiTheme="minorHAnsi" w:cstheme="minorBidi"/>
+        <w:kern w:val="2"/>
+        <w:sz w:val="24"/>
+        <w:szCs w:val="24"/>
+        <w:lang w:val="en-US" w:eastAsia="en-US" w:bidi="ar-SA"/>
+        <w14:ligatures w14:val="standardContextual"/>
       </w:rPr>
     </w:rPrDefault>
     <w:pPrDefault>
       <w:pPr>
-        <w:spacing w:line="276" w:lineRule="auto"/>
+        <w:spacing w:after="160" w:line="278" w:lineRule="auto"/>
       </w:pPr>
     </w:pPrDefault>
   </w:docDefaults>
@@ -3845,21 +3815,36 @@
   <w:style w:type="paragraph" w:default="1" w:styleId="Normal">
     <w:name w:val="Normal"/>
     <w:qFormat/>
-    <w:rsid w:val="001D74F2"/>
+    <w:rsid w:val="0006357E"/>
+    <w:pPr>
+      <w:spacing w:after="0" w:line="276" w:lineRule="auto"/>
+    </w:pPr>
+    <w:rPr>
+      <w:rFonts w:ascii="Arial" w:eastAsia="Arial" w:hAnsi="Arial" w:cs="Arial"/>
+      <w:kern w:val="0"/>
+      <w:sz w:val="22"/>
+      <w:szCs w:val="22"/>
+      <w:lang w:val="en"/>
+      <w14:ligatures w14:val="none"/>
+    </w:rPr>
   </w:style>
   <w:style w:type="paragraph" w:styleId="Heading1">
     <w:name w:val="heading 1"/>
     <w:basedOn w:val="Normal"/>
     <w:next w:val="Normal"/>
+    <w:link w:val="Heading1Char"/>
     <w:uiPriority w:val="9"/>
     <w:qFormat/>
+    <w:rsid w:val="00326645"/>
     <w:pPr>
       <w:keepNext/>
       <w:keepLines/>
-      <w:spacing w:before="400" w:after="120"/>
+      <w:spacing w:before="360" w:after="80"/>
       <w:outlineLvl w:val="0"/>
     </w:pPr>
     <w:rPr>
+      <w:rFonts w:asciiTheme="majorHAnsi" w:eastAsiaTheme="majorEastAsia" w:hAnsiTheme="majorHAnsi" w:cstheme="majorBidi"/>
+      <w:color w:val="2F5496" w:themeColor="accent1" w:themeShade="BF"/>
       <w:sz w:val="40"/>
       <w:szCs w:val="40"/>
     </w:rPr>
@@ -3868,16 +3853,20 @@
     <w:name w:val="heading 2"/>
     <w:basedOn w:val="Normal"/>
     <w:next w:val="Normal"/>
+    <w:link w:val="Heading2Char"/>
     <w:uiPriority w:val="9"/>
     <w:unhideWhenUsed/>
     <w:qFormat/>
+    <w:rsid w:val="00326645"/>
     <w:pPr>
       <w:keepNext/>
       <w:keepLines/>
-      <w:spacing w:before="360" w:after="120"/>
+      <w:spacing w:before="160" w:after="80"/>
       <w:outlineLvl w:val="1"/>
     </w:pPr>
     <w:rPr>
+      <w:rFonts w:asciiTheme="majorHAnsi" w:eastAsiaTheme="majorEastAsia" w:hAnsiTheme="majorHAnsi" w:cstheme="majorBidi"/>
+      <w:color w:val="2F5496" w:themeColor="accent1" w:themeShade="BF"/>
       <w:sz w:val="32"/>
       <w:szCs w:val="32"/>
     </w:rPr>
@@ -3886,17 +3875,20 @@
     <w:name w:val="heading 3"/>
     <w:basedOn w:val="Normal"/>
     <w:next w:val="Normal"/>
+    <w:link w:val="Heading3Char"/>
     <w:uiPriority w:val="9"/>
     <w:unhideWhenUsed/>
     <w:qFormat/>
+    <w:rsid w:val="00326645"/>
     <w:pPr>
       <w:keepNext/>
       <w:keepLines/>
-      <w:spacing w:before="320" w:after="80"/>
+      <w:spacing w:before="160" w:after="80"/>
       <w:outlineLvl w:val="2"/>
     </w:pPr>
     <w:rPr>
-      <w:color w:val="434343"/>
+      <w:rFonts w:eastAsiaTheme="majorEastAsia" w:cstheme="majorBidi"/>
+      <w:color w:val="2F5496" w:themeColor="accent1" w:themeShade="BF"/>
       <w:sz w:val="28"/>
       <w:szCs w:val="28"/>
     </w:rPr>
@@ -3905,62 +3897,136 @@
     <w:name w:val="heading 4"/>
     <w:basedOn w:val="Normal"/>
     <w:next w:val="Normal"/>
+    <w:link w:val="Heading4Char"/>
     <w:uiPriority w:val="9"/>
     <w:semiHidden/>
     <w:unhideWhenUsed/>
     <w:qFormat/>
+    <w:rsid w:val="00326645"/>
     <w:pPr>
       <w:keepNext/>
       <w:keepLines/>
-      <w:spacing w:before="280" w:after="80"/>
+      <w:spacing w:before="80" w:after="40"/>
       <w:outlineLvl w:val="3"/>
     </w:pPr>
     <w:rPr>
-      <w:color w:val="666666"/>
-      <w:sz w:val="24"/>
-      <w:szCs w:val="24"/>
+      <w:rFonts w:eastAsiaTheme="majorEastAsia" w:cstheme="majorBidi"/>
+      <w:i/>
+      <w:iCs/>
+      <w:color w:val="2F5496" w:themeColor="accent1" w:themeShade="BF"/>
     </w:rPr>
   </w:style>
   <w:style w:type="paragraph" w:styleId="Heading5">
     <w:name w:val="heading 5"/>
     <w:basedOn w:val="Normal"/>
     <w:next w:val="Normal"/>
+    <w:link w:val="Heading5Char"/>
     <w:uiPriority w:val="9"/>
     <w:semiHidden/>
     <w:unhideWhenUsed/>
     <w:qFormat/>
+    <w:rsid w:val="00326645"/>
     <w:pPr>
       <w:keepNext/>
       <w:keepLines/>
-      <w:spacing w:before="240" w:after="80"/>
+      <w:spacing w:before="80" w:after="40"/>
       <w:outlineLvl w:val="4"/>
     </w:pPr>
     <w:rPr>
-      <w:color w:val="666666"/>
+      <w:rFonts w:eastAsiaTheme="majorEastAsia" w:cstheme="majorBidi"/>
+      <w:color w:val="2F5496" w:themeColor="accent1" w:themeShade="BF"/>
     </w:rPr>
   </w:style>
   <w:style w:type="paragraph" w:styleId="Heading6">
     <w:name w:val="heading 6"/>
     <w:basedOn w:val="Normal"/>
     <w:next w:val="Normal"/>
+    <w:link w:val="Heading6Char"/>
     <w:uiPriority w:val="9"/>
     <w:semiHidden/>
     <w:unhideWhenUsed/>
     <w:qFormat/>
+    <w:rsid w:val="00326645"/>
     <w:pPr>
       <w:keepNext/>
       <w:keepLines/>
-      <w:spacing w:before="240" w:after="80"/>
+      <w:spacing w:before="40"/>
       <w:outlineLvl w:val="5"/>
     </w:pPr>
     <w:rPr>
+      <w:rFonts w:eastAsiaTheme="majorEastAsia" w:cstheme="majorBidi"/>
       <w:i/>
-      <w:color w:val="666666"/>
+      <w:iCs/>
+      <w:color w:val="595959" w:themeColor="text1" w:themeTint="A6"/>
+    </w:rPr>
+  </w:style>
+  <w:style w:type="paragraph" w:styleId="Heading7">
+    <w:name w:val="heading 7"/>
+    <w:basedOn w:val="Normal"/>
+    <w:next w:val="Normal"/>
+    <w:link w:val="Heading7Char"/>
+    <w:uiPriority w:val="9"/>
+    <w:semiHidden/>
+    <w:unhideWhenUsed/>
+    <w:qFormat/>
+    <w:rsid w:val="00326645"/>
+    <w:pPr>
+      <w:keepNext/>
+      <w:keepLines/>
+      <w:spacing w:before="40"/>
+      <w:outlineLvl w:val="6"/>
+    </w:pPr>
+    <w:rPr>
+      <w:rFonts w:eastAsiaTheme="majorEastAsia" w:cstheme="majorBidi"/>
+      <w:color w:val="595959" w:themeColor="text1" w:themeTint="A6"/>
+    </w:rPr>
+  </w:style>
+  <w:style w:type="paragraph" w:styleId="Heading8">
+    <w:name w:val="heading 8"/>
+    <w:basedOn w:val="Normal"/>
+    <w:next w:val="Normal"/>
+    <w:link w:val="Heading8Char"/>
+    <w:uiPriority w:val="9"/>
+    <w:semiHidden/>
+    <w:unhideWhenUsed/>
+    <w:qFormat/>
+    <w:rsid w:val="00326645"/>
+    <w:pPr>
+      <w:keepNext/>
+      <w:keepLines/>
+      <w:outlineLvl w:val="7"/>
+    </w:pPr>
+    <w:rPr>
+      <w:rFonts w:eastAsiaTheme="majorEastAsia" w:cstheme="majorBidi"/>
+      <w:i/>
+      <w:iCs/>
+      <w:color w:val="272727" w:themeColor="text1" w:themeTint="D8"/>
+    </w:rPr>
+  </w:style>
+  <w:style w:type="paragraph" w:styleId="Heading9">
+    <w:name w:val="heading 9"/>
+    <w:basedOn w:val="Normal"/>
+    <w:next w:val="Normal"/>
+    <w:link w:val="Heading9Char"/>
+    <w:uiPriority w:val="9"/>
+    <w:semiHidden/>
+    <w:unhideWhenUsed/>
+    <w:qFormat/>
+    <w:rsid w:val="00326645"/>
+    <w:pPr>
+      <w:keepNext/>
+      <w:keepLines/>
+      <w:outlineLvl w:val="8"/>
+    </w:pPr>
+    <w:rPr>
+      <w:rFonts w:eastAsiaTheme="majorEastAsia" w:cstheme="majorBidi"/>
+      <w:color w:val="272727" w:themeColor="text1" w:themeTint="D8"/>
     </w:rPr>
   </w:style>
   <w:style w:type="character" w:default="1" w:styleId="DefaultParagraphFont">
     <w:name w:val="Default Paragraph Font"/>
     <w:uiPriority w:val="1"/>
+    <w:semiHidden/>
     <w:unhideWhenUsed/>
   </w:style>
   <w:style w:type="table" w:default="1" w:styleId="TableNormal">
@@ -3984,48 +4050,220 @@
     <w:semiHidden/>
     <w:unhideWhenUsed/>
   </w:style>
-  <w:style w:type="table" w:customStyle="1" w:styleId="TableNormal0">
-    <w:name w:val="TableNormal"/>
-    <w:tblPr>
-      <w:tblCellMar>
-        <w:top w:w="0" w:type="dxa"/>
-        <w:left w:w="0" w:type="dxa"/>
-        <w:bottom w:w="0" w:type="dxa"/>
-        <w:right w:w="0" w:type="dxa"/>
-      </w:tblCellMar>
-    </w:tblPr>
+  <w:style w:type="character" w:customStyle="1" w:styleId="Heading1Char">
+    <w:name w:val="Heading 1 Char"/>
+    <w:basedOn w:val="DefaultParagraphFont"/>
+    <w:link w:val="Heading1"/>
+    <w:uiPriority w:val="9"/>
+    <w:rsid w:val="00326645"/>
+    <w:rPr>
+      <w:rFonts w:asciiTheme="majorHAnsi" w:eastAsiaTheme="majorEastAsia" w:hAnsiTheme="majorHAnsi" w:cstheme="majorBidi"/>
+      <w:color w:val="2F5496" w:themeColor="accent1" w:themeShade="BF"/>
+      <w:sz w:val="40"/>
+      <w:szCs w:val="40"/>
+    </w:rPr>
+  </w:style>
+  <w:style w:type="character" w:customStyle="1" w:styleId="Heading2Char">
+    <w:name w:val="Heading 2 Char"/>
+    <w:basedOn w:val="DefaultParagraphFont"/>
+    <w:link w:val="Heading2"/>
+    <w:uiPriority w:val="9"/>
+    <w:rsid w:val="00326645"/>
+    <w:rPr>
+      <w:rFonts w:asciiTheme="majorHAnsi" w:eastAsiaTheme="majorEastAsia" w:hAnsiTheme="majorHAnsi" w:cstheme="majorBidi"/>
+      <w:color w:val="2F5496" w:themeColor="accent1" w:themeShade="BF"/>
+      <w:sz w:val="32"/>
+      <w:szCs w:val="32"/>
+    </w:rPr>
+  </w:style>
+  <w:style w:type="character" w:customStyle="1" w:styleId="Heading3Char">
+    <w:name w:val="Heading 3 Char"/>
+    <w:basedOn w:val="DefaultParagraphFont"/>
+    <w:link w:val="Heading3"/>
+    <w:uiPriority w:val="9"/>
+    <w:rsid w:val="00326645"/>
+    <w:rPr>
+      <w:rFonts w:eastAsiaTheme="majorEastAsia" w:cstheme="majorBidi"/>
+      <w:color w:val="2F5496" w:themeColor="accent1" w:themeShade="BF"/>
+      <w:sz w:val="28"/>
+      <w:szCs w:val="28"/>
+    </w:rPr>
+  </w:style>
+  <w:style w:type="character" w:customStyle="1" w:styleId="Heading4Char">
+    <w:name w:val="Heading 4 Char"/>
+    <w:basedOn w:val="DefaultParagraphFont"/>
+    <w:link w:val="Heading4"/>
+    <w:uiPriority w:val="9"/>
+    <w:semiHidden/>
+    <w:rsid w:val="00326645"/>
+    <w:rPr>
+      <w:rFonts w:eastAsiaTheme="majorEastAsia" w:cstheme="majorBidi"/>
+      <w:i/>
+      <w:iCs/>
+      <w:color w:val="2F5496" w:themeColor="accent1" w:themeShade="BF"/>
+    </w:rPr>
+  </w:style>
+  <w:style w:type="character" w:customStyle="1" w:styleId="Heading5Char">
+    <w:name w:val="Heading 5 Char"/>
+    <w:basedOn w:val="DefaultParagraphFont"/>
+    <w:link w:val="Heading5"/>
+    <w:uiPriority w:val="9"/>
+    <w:semiHidden/>
+    <w:rsid w:val="00326645"/>
+    <w:rPr>
+      <w:rFonts w:eastAsiaTheme="majorEastAsia" w:cstheme="majorBidi"/>
+      <w:color w:val="2F5496" w:themeColor="accent1" w:themeShade="BF"/>
+    </w:rPr>
+  </w:style>
+  <w:style w:type="character" w:customStyle="1" w:styleId="Heading6Char">
+    <w:name w:val="Heading 6 Char"/>
+    <w:basedOn w:val="DefaultParagraphFont"/>
+    <w:link w:val="Heading6"/>
+    <w:uiPriority w:val="9"/>
+    <w:semiHidden/>
+    <w:rsid w:val="00326645"/>
+    <w:rPr>
+      <w:rFonts w:eastAsiaTheme="majorEastAsia" w:cstheme="majorBidi"/>
+      <w:i/>
+      <w:iCs/>
+      <w:color w:val="595959" w:themeColor="text1" w:themeTint="A6"/>
+    </w:rPr>
+  </w:style>
+  <w:style w:type="character" w:customStyle="1" w:styleId="Heading7Char">
+    <w:name w:val="Heading 7 Char"/>
+    <w:basedOn w:val="DefaultParagraphFont"/>
+    <w:link w:val="Heading7"/>
+    <w:uiPriority w:val="9"/>
+    <w:semiHidden/>
+    <w:rsid w:val="00326645"/>
+    <w:rPr>
+      <w:rFonts w:eastAsiaTheme="majorEastAsia" w:cstheme="majorBidi"/>
+      <w:color w:val="595959" w:themeColor="text1" w:themeTint="A6"/>
+    </w:rPr>
+  </w:style>
+  <w:style w:type="character" w:customStyle="1" w:styleId="Heading8Char">
+    <w:name w:val="Heading 8 Char"/>
+    <w:basedOn w:val="DefaultParagraphFont"/>
+    <w:link w:val="Heading8"/>
+    <w:uiPriority w:val="9"/>
+    <w:semiHidden/>
+    <w:rsid w:val="00326645"/>
+    <w:rPr>
+      <w:rFonts w:eastAsiaTheme="majorEastAsia" w:cstheme="majorBidi"/>
+      <w:i/>
+      <w:iCs/>
+      <w:color w:val="272727" w:themeColor="text1" w:themeTint="D8"/>
+    </w:rPr>
+  </w:style>
+  <w:style w:type="character" w:customStyle="1" w:styleId="Heading9Char">
+    <w:name w:val="Heading 9 Char"/>
+    <w:basedOn w:val="DefaultParagraphFont"/>
+    <w:link w:val="Heading9"/>
+    <w:uiPriority w:val="9"/>
+    <w:semiHidden/>
+    <w:rsid w:val="00326645"/>
+    <w:rPr>
+      <w:rFonts w:eastAsiaTheme="majorEastAsia" w:cstheme="majorBidi"/>
+      <w:color w:val="272727" w:themeColor="text1" w:themeTint="D8"/>
+    </w:rPr>
   </w:style>
   <w:style w:type="paragraph" w:styleId="Title">
     <w:name w:val="Title"/>
     <w:basedOn w:val="Normal"/>
     <w:next w:val="Normal"/>
+    <w:link w:val="TitleChar"/>
     <w:uiPriority w:val="10"/>
     <w:qFormat/>
+    <w:rsid w:val="00326645"/>
     <w:pPr>
-      <w:keepNext/>
-      <w:keepLines/>
-      <w:spacing w:after="60"/>
+      <w:spacing w:after="80" w:line="240" w:lineRule="auto"/>
+      <w:contextualSpacing/>
     </w:pPr>
     <w:rPr>
-      <w:sz w:val="52"/>
-      <w:szCs w:val="52"/>
+      <w:rFonts w:asciiTheme="majorHAnsi" w:eastAsiaTheme="majorEastAsia" w:hAnsiTheme="majorHAnsi" w:cstheme="majorBidi"/>
+      <w:spacing w:val="-10"/>
+      <w:kern w:val="28"/>
+      <w:sz w:val="56"/>
+      <w:szCs w:val="56"/>
+    </w:rPr>
+  </w:style>
+  <w:style w:type="character" w:customStyle="1" w:styleId="TitleChar">
+    <w:name w:val="Title Char"/>
+    <w:basedOn w:val="DefaultParagraphFont"/>
+    <w:link w:val="Title"/>
+    <w:uiPriority w:val="10"/>
+    <w:rsid w:val="00326645"/>
+    <w:rPr>
+      <w:rFonts w:asciiTheme="majorHAnsi" w:eastAsiaTheme="majorEastAsia" w:hAnsiTheme="majorHAnsi" w:cstheme="majorBidi"/>
+      <w:spacing w:val="-10"/>
+      <w:kern w:val="28"/>
+      <w:sz w:val="56"/>
+      <w:szCs w:val="56"/>
     </w:rPr>
   </w:style>
   <w:style w:type="paragraph" w:styleId="Subtitle">
     <w:name w:val="Subtitle"/>
     <w:basedOn w:val="Normal"/>
     <w:next w:val="Normal"/>
+    <w:link w:val="SubtitleChar"/>
     <w:uiPriority w:val="11"/>
     <w:qFormat/>
+    <w:rsid w:val="00326645"/>
     <w:pPr>
-      <w:keepNext/>
-      <w:keepLines/>
-      <w:spacing w:after="320"/>
+      <w:numPr>
+        <w:ilvl w:val="1"/>
+      </w:numPr>
     </w:pPr>
     <w:rPr>
-      <w:color w:val="666666"/>
-      <w:sz w:val="30"/>
-      <w:szCs w:val="30"/>
+      <w:rFonts w:eastAsiaTheme="majorEastAsia" w:cstheme="majorBidi"/>
+      <w:color w:val="595959" w:themeColor="text1" w:themeTint="A6"/>
+      <w:spacing w:val="15"/>
+      <w:sz w:val="28"/>
+      <w:szCs w:val="28"/>
+    </w:rPr>
+  </w:style>
+  <w:style w:type="character" w:customStyle="1" w:styleId="SubtitleChar">
+    <w:name w:val="Subtitle Char"/>
+    <w:basedOn w:val="DefaultParagraphFont"/>
+    <w:link w:val="Subtitle"/>
+    <w:uiPriority w:val="11"/>
+    <w:rsid w:val="00326645"/>
+    <w:rPr>
+      <w:rFonts w:eastAsiaTheme="majorEastAsia" w:cstheme="majorBidi"/>
+      <w:color w:val="595959" w:themeColor="text1" w:themeTint="A6"/>
+      <w:spacing w:val="15"/>
+      <w:sz w:val="28"/>
+      <w:szCs w:val="28"/>
+    </w:rPr>
+  </w:style>
+  <w:style w:type="paragraph" w:styleId="Quote">
+    <w:name w:val="Quote"/>
+    <w:basedOn w:val="Normal"/>
+    <w:next w:val="Normal"/>
+    <w:link w:val="QuoteChar"/>
+    <w:uiPriority w:val="29"/>
+    <w:qFormat/>
+    <w:rsid w:val="00326645"/>
+    <w:pPr>
+      <w:spacing w:before="160"/>
+      <w:jc w:val="center"/>
+    </w:pPr>
+    <w:rPr>
+      <w:i/>
+      <w:iCs/>
+      <w:color w:val="404040" w:themeColor="text1" w:themeTint="BF"/>
+    </w:rPr>
+  </w:style>
+  <w:style w:type="character" w:customStyle="1" w:styleId="QuoteChar">
+    <w:name w:val="Quote Char"/>
+    <w:basedOn w:val="DefaultParagraphFont"/>
+    <w:link w:val="Quote"/>
+    <w:uiPriority w:val="29"/>
+    <w:rsid w:val="00326645"/>
+    <w:rPr>
+      <w:i/>
+      <w:iCs/>
+      <w:color w:val="404040" w:themeColor="text1" w:themeTint="BF"/>
     </w:rPr>
   </w:style>
   <w:style w:type="paragraph" w:styleId="ListParagraph">
@@ -4033,11 +4271,72 @@
     <w:basedOn w:val="Normal"/>
     <w:uiPriority w:val="34"/>
     <w:qFormat/>
-    <w:rsid w:val="00A82575"/>
+    <w:rsid w:val="00326645"/>
     <w:pPr>
       <w:ind w:left="720"/>
       <w:contextualSpacing/>
     </w:pPr>
+  </w:style>
+  <w:style w:type="character" w:styleId="IntenseEmphasis">
+    <w:name w:val="Intense Emphasis"/>
+    <w:basedOn w:val="DefaultParagraphFont"/>
+    <w:uiPriority w:val="21"/>
+    <w:qFormat/>
+    <w:rsid w:val="00326645"/>
+    <w:rPr>
+      <w:i/>
+      <w:iCs/>
+      <w:color w:val="2F5496" w:themeColor="accent1" w:themeShade="BF"/>
+    </w:rPr>
+  </w:style>
+  <w:style w:type="paragraph" w:styleId="IntenseQuote">
+    <w:name w:val="Intense Quote"/>
+    <w:basedOn w:val="Normal"/>
+    <w:next w:val="Normal"/>
+    <w:link w:val="IntenseQuoteChar"/>
+    <w:uiPriority w:val="30"/>
+    <w:qFormat/>
+    <w:rsid w:val="00326645"/>
+    <w:pPr>
+      <w:pBdr>
+        <w:top w:val="single" w:sz="4" w:space="10" w:color="2F5496" w:themeColor="accent1" w:themeShade="BF"/>
+        <w:bottom w:val="single" w:sz="4" w:space="10" w:color="2F5496" w:themeColor="accent1" w:themeShade="BF"/>
+      </w:pBdr>
+      <w:spacing w:before="360" w:after="360"/>
+      <w:ind w:left="864" w:right="864"/>
+      <w:jc w:val="center"/>
+    </w:pPr>
+    <w:rPr>
+      <w:i/>
+      <w:iCs/>
+      <w:color w:val="2F5496" w:themeColor="accent1" w:themeShade="BF"/>
+    </w:rPr>
+  </w:style>
+  <w:style w:type="character" w:customStyle="1" w:styleId="IntenseQuoteChar">
+    <w:name w:val="Intense Quote Char"/>
+    <w:basedOn w:val="DefaultParagraphFont"/>
+    <w:link w:val="IntenseQuote"/>
+    <w:uiPriority w:val="30"/>
+    <w:rsid w:val="00326645"/>
+    <w:rPr>
+      <w:i/>
+      <w:iCs/>
+      <w:color w:val="2F5496" w:themeColor="accent1" w:themeShade="BF"/>
+    </w:rPr>
+  </w:style>
+  <w:style w:type="character" w:styleId="IntenseReference">
+    <w:name w:val="Intense Reference"/>
+    <w:basedOn w:val="DefaultParagraphFont"/>
+    <w:uiPriority w:val="32"/>
+    <w:qFormat/>
+    <w:rsid w:val="00326645"/>
+    <w:rPr>
+      <w:b/>
+      <w:bCs/>
+      <w:smallCaps/>
+      <w:color w:val="2F5496" w:themeColor="accent1" w:themeShade="BF"/>
+      <w:spacing w:val="5"/>
+    </w:rPr>
   </w:style>
 </w:styles>
 </file>
@@ -4053,44 +4352,44 @@
         <a:sysClr val="window" lastClr="FFFFFF"/>
       </a:lt1>
       <a:dk2>
-        <a:srgbClr val="1F497D"/>
+        <a:srgbClr val="44546A"/>
       </a:dk2>
       <a:lt2>
-        <a:srgbClr val="EEECE1"/>
+        <a:srgbClr val="E7E6E6"/>
       </a:lt2>
       <a:accent1>
-        <a:srgbClr val="4F81BD"/>
+        <a:srgbClr val="4472C4"/>
       </a:accent1>
       <a:accent2>
-        <a:srgbClr val="C0504D"/>
+        <a:srgbClr val="ED7D31"/>
       </a:accent2>
       <a:accent3>
-        <a:srgbClr val="9BBB59"/>
+        <a:srgbClr val="A5A5A5"/>
       </a:accent3>
       <a:accent4>
-        <a:srgbClr val="8064A2"/>
+        <a:srgbClr val="FFC000"/>
       </a:accent4>
       <a:accent5>
-        <a:srgbClr val="4BACC6"/>
+        <a:srgbClr val="5B9BD5"/>
       </a:accent5>
       <a:accent6>
-        <a:srgbClr val="F79646"/>
+        <a:srgbClr val="70AD47"/>
       </a:accent6>
       <a:hlink>
-        <a:srgbClr val="0000FF"/>
+        <a:srgbClr val="0563C1"/>
       </a:hlink>
       <a:folHlink>
-        <a:srgbClr val="800080"/>
+        <a:srgbClr val="954F72"/>
       </a:folHlink>
     </a:clrScheme>
     <a:fontScheme name="Office">
       <a:majorFont>
-        <a:latin typeface="Calibri"/>
+        <a:latin typeface="Calibri Light" panose="020F0302020204030204"/>
         <a:ea typeface=""/>
         <a:cs typeface=""/>
-        <a:font script="Jpan" typeface="ＭＳ ゴシック"/>
+        <a:font script="Jpan" typeface="游ゴシック Light"/>
         <a:font script="Hang" typeface="맑은 고딕"/>
-        <a:font script="Hans" typeface="宋体"/>
+        <a:font script="Hans" typeface="等线 Light"/>
         <a:font script="Hant" typeface="新細明體"/>
         <a:font script="Arab" typeface="Times New Roman"/>
         <a:font script="Hebr" typeface="Times New Roman"/>
@@ -4118,14 +4417,31 @@
         <a:font script="Viet" typeface="Times New Roman"/>
         <a:font script="Uigh" typeface="Microsoft Uighur"/>
         <a:font script="Geor" typeface="Sylfaen"/>
+        <a:font script="Armn" typeface="Arial"/>
+        <a:font script="Bugi" typeface="Leelawadee UI"/>
+        <a:font script="Bopo" typeface="Microsoft JhengHei"/>
+        <a:font script="Java" typeface="Javanese Text"/>
+        <a:font script="Lisu" typeface="Segoe UI"/>
+        <a:font script="Mymr" typeface="Myanmar Text"/>
+        <a:font script="Nkoo" typeface="Ebrima"/>
+        <a:font script="Olck" typeface="Nirmala UI"/>
+        <a:font script="Osma" typeface="Ebrima"/>
+        <a:font script="Phag" typeface="Phagspa"/>
+        <a:font script="Syrn" typeface="Estrangelo Edessa"/>
+        <a:font script="Syrj" typeface="Estrangelo Edessa"/>
+        <a:font script="Syre" typeface="Estrangelo Edessa"/>
+        <a:font script="Sora" typeface="Nirmala UI"/>
+        <a:font script="Tale" typeface="Microsoft Tai Le"/>
+        <a:font script="Talu" typeface="Microsoft New Tai Lue"/>
+        <a:font script="Tfng" typeface="Ebrima"/>
       </a:majorFont>
       <a:minorFont>
-        <a:latin typeface="Cambria"/>
+        <a:latin typeface="Calibri" panose="020F0502020204030204"/>
         <a:ea typeface=""/>
         <a:cs typeface=""/>
-        <a:font script="Jpan" typeface="ＭＳ 明朝"/>
+        <a:font script="Jpan" typeface="游ゴシック"/>
         <a:font script="Hang" typeface="맑은 고딕"/>
-        <a:font script="Hans" typeface="宋体"/>
+        <a:font script="Hans" typeface="等线"/>
         <a:font script="Hant" typeface="新細明體"/>
         <a:font script="Arab" typeface="Arial"/>
         <a:font script="Hebr" typeface="Arial"/>
@@ -4153,6 +4469,23 @@
         <a:font script="Viet" typeface="Arial"/>
         <a:font script="Uigh" typeface="Microsoft Uighur"/>
         <a:font script="Geor" typeface="Sylfaen"/>
+        <a:font script="Armn" typeface="Arial"/>
+        <a:font script="Bugi" typeface="Leelawadee UI"/>
+        <a:font script="Bopo" typeface="Microsoft JhengHei"/>
+        <a:font script="Java" typeface="Javanese Text"/>
+        <a:font script="Lisu" typeface="Segoe UI"/>
+        <a:font script="Mymr" typeface="Myanmar Text"/>
+        <a:font script="Nkoo" typeface="Ebrima"/>
+        <a:font script="Olck" typeface="Nirmala UI"/>
+        <a:font script="Osma" typeface="Ebrima"/>
+        <a:font script="Phag" typeface="Phagspa"/>
+        <a:font script="Syrn" typeface="Estrangelo Edessa"/>
+        <a:font script="Syrj" typeface="Estrangelo Edessa"/>
+        <a:font script="Syre" typeface="Estrangelo Edessa"/>
+        <a:font script="Sora" typeface="Nirmala UI"/>
+        <a:font script="Tale" typeface="Microsoft Tai Le"/>
+        <a:font script="Talu" typeface="Microsoft New Tai Lue"/>
+        <a:font script="Tfng" typeface="Ebrima"/>
       </a:minorFont>
     </a:fontScheme>
     <a:fmtScheme name="Office">
@@ -4164,200 +4497,141 @@
           <a:gsLst>
             <a:gs pos="0">
               <a:schemeClr val="phClr">
-                <a:tint val="50000"/>
-                <a:satMod val="300000"/>
+                <a:lumMod val="110000"/>
+                <a:satMod val="105000"/>
+                <a:tint val="67000"/>
               </a:schemeClr>
             </a:gs>
-            <a:gs pos="35000">
+            <a:gs pos="50000">
               <a:schemeClr val="phClr">
-                <a:tint val="37000"/>
-                <a:satMod val="300000"/>
+                <a:lumMod val="105000"/>
+                <a:satMod val="103000"/>
+                <a:tint val="73000"/>
               </a:schemeClr>
             </a:gs>
             <a:gs pos="100000">
               <a:schemeClr val="phClr">
-                <a:tint val="15000"/>
-                <a:satMod val="350000"/>
+                <a:lumMod val="105000"/>
+                <a:satMod val="109000"/>
+                <a:tint val="81000"/>
               </a:schemeClr>
             </a:gs>
           </a:gsLst>
-          <a:lin ang="16200000" scaled="1"/>
+          <a:lin ang="5400000" scaled="0"/>
         </a:gradFill>
         <a:gradFill rotWithShape="1">
           <a:gsLst>
             <a:gs pos="0">
               <a:schemeClr val="phClr">
-                <a:tint val="100000"/>
+                <a:satMod val="103000"/>
+                <a:lumMod val="102000"/>
+                <a:tint val="94000"/>
+              </a:schemeClr>
+            </a:gs>
+            <a:gs pos="50000">
+              <a:schemeClr val="phClr">
+                <a:satMod val="110000"/>
+                <a:lumMod val="100000"/>
                 <a:shade val="100000"/>
-                <a:satMod val="130000"/>
               </a:schemeClr>
             </a:gs>
             <a:gs pos="100000">
               <a:schemeClr val="phClr">
-                <a:tint val="50000"/>
-                <a:shade val="100000"/>
-                <a:satMod val="350000"/>
+                <a:lumMod val="99000"/>
+                <a:satMod val="120000"/>
+                <a:shade val="78000"/>
               </a:schemeClr>
             </a:gs>
           </a:gsLst>
-          <a:lin ang="16200000" scaled="0"/>
+          <a:lin ang="5400000" scaled="0"/>
         </a:gradFill>
       </a:fillStyleLst>
       <a:lnStyleLst>
-        <a:ln w="9525" cap="flat" cmpd="sng" algn="ctr">
-          <a:solidFill>
-            <a:schemeClr val="phClr">
-              <a:shade val="95000"/>
-              <a:satMod val="105000"/>
-            </a:schemeClr>
-          </a:solidFill>
-          <a:prstDash val="solid"/>
-        </a:ln>
-        <a:ln w="25400" cap="flat" cmpd="sng" algn="ctr">
+        <a:ln w="6350" cap="flat" cmpd="sng" algn="ctr">
           <a:solidFill>
             <a:schemeClr val="phClr"/>
           </a:solidFill>
           <a:prstDash val="solid"/>
+          <a:miter lim="800000"/>
         </a:ln>
-        <a:ln w="38100" cap="flat" cmpd="sng" algn="ctr">
+        <a:ln w="12700" cap="flat" cmpd="sng" algn="ctr">
           <a:solidFill>
             <a:schemeClr val="phClr"/>
           </a:solidFill>
           <a:prstDash val="solid"/>
+          <a:miter lim="800000"/>
+        </a:ln>
+        <a:ln w="19050" cap="flat" cmpd="sng" algn="ctr">
+          <a:solidFill>
+            <a:schemeClr val="phClr"/>
+          </a:solidFill>
+          <a:prstDash val="solid"/>
+          <a:miter lim="800000"/>
         </a:ln>
       </a:lnStyleLst>
       <a:effectStyleLst>
         <a:effectStyle>
+          <a:effectLst/>
+        </a:effectStyle>
+        <a:effectStyle>
+          <a:effectLst/>
+        </a:effectStyle>
+        <a:effectStyle>
           <a:effectLst>
-            <a:outerShdw blurRad="40000" dist="20000" dir="5400000" rotWithShape="0">
+            <a:outerShdw blurRad="57150" dist="19050" dir="5400000" algn="ctr" rotWithShape="0">
               <a:srgbClr val="000000">
-                <a:alpha val="38000"/>
+                <a:alpha val="63000"/>
               </a:srgbClr>
             </a:outerShdw>
           </a:effectLst>
-        </a:effectStyle>
-        <a:effectStyle>
-          <a:effectLst>
-            <a:outerShdw blurRad="40000" dist="23000" dir="5400000" rotWithShape="0">
-              <a:srgbClr val="000000">
-                <a:alpha val="35000"/>
-              </a:srgbClr>
-            </a:outerShdw>
-          </a:effectLst>
-        </a:effectStyle>
-        <a:effectStyle>
-          <a:effectLst>
-            <a:outerShdw blurRad="40000" dist="23000" dir="5400000" rotWithShape="0">
-              <a:srgbClr val="000000">
-                <a:alpha val="35000"/>
-              </a:srgbClr>
-            </a:outerShdw>
-          </a:effectLst>
-          <a:scene3d>
-            <a:camera prst="orthographicFront">
-              <a:rot lat="0" lon="0" rev="0"/>
-            </a:camera>
-            <a:lightRig rig="threePt" dir="t">
-              <a:rot lat="0" lon="0" rev="1200000"/>
-            </a:lightRig>
-          </a:scene3d>
-          <a:sp3d>
-            <a:bevelT w="63500" h="25400"/>
-          </a:sp3d>
         </a:effectStyle>
       </a:effectStyleLst>
       <a:bgFillStyleLst>
         <a:solidFill>
           <a:schemeClr val="phClr"/>
         </a:solidFill>
+        <a:solidFill>
+          <a:schemeClr val="phClr">
+            <a:tint val="95000"/>
+            <a:satMod val="170000"/>
+          </a:schemeClr>
+        </a:solidFill>
         <a:gradFill rotWithShape="1">
           <a:gsLst>
             <a:gs pos="0">
               <a:schemeClr val="phClr">
-                <a:tint val="40000"/>
-                <a:satMod val="350000"/>
+                <a:tint val="93000"/>
+                <a:satMod val="150000"/>
+                <a:shade val="98000"/>
+                <a:lumMod val="102000"/>
               </a:schemeClr>
             </a:gs>
-            <a:gs pos="40000">
+            <a:gs pos="50000">
               <a:schemeClr val="phClr">
-                <a:tint val="45000"/>
-                <a:shade val="99000"/>
-                <a:satMod val="350000"/>
+                <a:tint val="98000"/>
+                <a:satMod val="130000"/>
+                <a:shade val="90000"/>
+                <a:lumMod val="103000"/>
               </a:schemeClr>
             </a:gs>
             <a:gs pos="100000">
               <a:schemeClr val="phClr">
-                <a:shade val="20000"/>
-                <a:satMod val="255000"/>
+                <a:shade val="63000"/>
+                <a:satMod val="120000"/>
               </a:schemeClr>
             </a:gs>
           </a:gsLst>
-          <a:path path="circle">
-            <a:fillToRect l="50000" t="-80000" r="50000" b="180000"/>
-          </a:path>
-        </a:gradFill>
-        <a:gradFill rotWithShape="1">
-          <a:gsLst>
-            <a:gs pos="0">
-              <a:schemeClr val="phClr">
-                <a:tint val="80000"/>
-                <a:satMod val="300000"/>
-              </a:schemeClr>
-            </a:gs>
-            <a:gs pos="100000">
-              <a:schemeClr val="phClr">
-                <a:shade val="30000"/>
-                <a:satMod val="200000"/>
-              </a:schemeClr>
-            </a:gs>
-          </a:gsLst>
-          <a:path path="circle">
-            <a:fillToRect l="50000" t="50000" r="50000" b="50000"/>
-          </a:path>
+          <a:lin ang="5400000" scaled="0"/>
         </a:gradFill>
       </a:bgFillStyleLst>
     </a:fmtScheme>
   </a:themeElements>
-  <a:objectDefaults>
-    <a:spDef>
-      <a:spPr/>
-      <a:bodyPr/>
-      <a:lstStyle/>
-      <a:style>
-        <a:lnRef idx="1">
-          <a:schemeClr val="accent1"/>
-        </a:lnRef>
-        <a:fillRef idx="3">
-          <a:schemeClr val="accent1"/>
-        </a:fillRef>
-        <a:effectRef idx="2">
-          <a:schemeClr val="accent1"/>
-        </a:effectRef>
-        <a:fontRef idx="minor">
-          <a:schemeClr val="lt1"/>
-        </a:fontRef>
-      </a:style>
-    </a:spDef>
-    <a:lnDef>
-      <a:spPr/>
-      <a:bodyPr/>
-      <a:lstStyle/>
-      <a:style>
-        <a:lnRef idx="2">
-          <a:schemeClr val="accent1"/>
-        </a:lnRef>
-        <a:fillRef idx="0">
-          <a:schemeClr val="accent1"/>
-        </a:fillRef>
-        <a:effectRef idx="1">
-          <a:schemeClr val="accent1"/>
-        </a:effectRef>
-        <a:fontRef idx="minor">
-          <a:schemeClr val="tx1"/>
-        </a:fontRef>
-      </a:style>
-    </a:lnDef>
-  </a:objectDefaults>
+  <a:objectDefaults/>
   <a:extraClrSchemeLst/>
+  <a:extLst>
+    <a:ext uri="{05A4C25C-085E-4340-85A3-A5531E510DB2}">
+      <thm15:themeFamily xmlns:thm15="http://schemas.microsoft.com/office/thememl/2012/main" name="Office Theme" id="{62F939B6-93AF-4DB8-9C6B-D6C7DFDC589F}" vid="{4A3C46E8-61CC-4603-A589-7422A47A8E4A}"/>
+    </a:ext>
+  </a:extLst>
 </a:theme>
 </file>
</xml_diff>